<commit_message>
docs: restored 100% full verbatim text of Live Dia 1 script from original PDF
</commit_message>
<xml_diff>
--- a/Guion_Produccion_Live_Dia_1_El_Saboteador.docx
+++ b/Guion_Produccion_Live_Dia_1_El_Saboteador.docx
@@ -47,7 +47,7 @@
           <w:color w:val="0F172A"/>
           <w:sz w:val="30"/>
         </w:rPr>
-        <w:t>El Sistema de Retención en YouTube Live (Léelo antes del guión)</w:t>
+        <w:t>El sistema de retención (léelo antes del guión)</w:t>
       </w:r>
     </w:p>
     <w:p>
@@ -55,15 +55,16 @@
         <w:spacing w:before="60" w:after="80"/>
       </w:pPr>
       <w:r>
-        <w:t>En YouTube Live la gente no se va porque el contenido sea malo — se va porque pasaron 4 minutos sin que nadie le pidiera nada o porque los enviaron fuera de la plataforma a mitad del live. Este guión está construido sobre 6 reglas de producción en vivo:</w:t>
+        <w:t>En YouTube la gente no se va porque el contenido sea malo — se va porque pasaron 4 minutos sin que nadie le pidiera nada o porque los enviaron fuera de la plataforma a mitad del live. Este guión está construido sobre 6 reglas:</w:t>
       </w:r>
     </w:p>
     <w:p>
       <w:pPr>
-        <w:pStyle w:val="ListNumber"/>
-        <w:spacing w:before="40" w:after="40"/>
-      </w:pPr>
-      <w:r/>
+        <w:spacing w:before="60" w:after="80"/>
+      </w:pPr>
+      <w:r>
+        <w:t xml:space="preserve">• </w:t>
+      </w:r>
       <w:r>
         <w:rPr>
           <w:b/>
@@ -71,15 +72,16 @@
         <w:t>Regla de los 3 minutos</w:t>
       </w:r>
       <w:r>
-        <w:t>: ninguna sección pasa de 3 minutos sin una acción del espectador (chat storm, lectura de nombres o encuesta de YouTube). Hay 12 momentos de interacción en 45 minutos.</w:t>
+        <w:t>: ninguna sección pasa de 3 minutos sin una acción del espectador (encuesta de YouTube, chat storm, votación, quiz de chat). Hay 12 momentos de interacción en 45 minutos.</w:t>
       </w:r>
     </w:p>
     <w:p>
       <w:pPr>
-        <w:pStyle w:val="ListNumber"/>
-        <w:spacing w:before="40" w:after="40"/>
-      </w:pPr>
-      <w:r/>
+        <w:spacing w:before="60" w:after="80"/>
+      </w:pPr>
+      <w:r>
+        <w:t xml:space="preserve">• </w:t>
+      </w:r>
       <w:r>
         <w:rPr>
           <w:b/>
@@ -87,56 +89,50 @@
         <w:t>Open loops declarados</w:t>
       </w:r>
       <w:r>
-        <w:t>: en el minuto 4 Juan Villegas anuncia 3 cosas que va a revelar más adelante y CUÁNDO (*"en el minuto 42 les muestro el saldo exacto de mi cuenta"*). El cerebro odia los loops abiertos — se queda hasta el final a cerrarlos.</w:t>
+        <w:t>: en el minuto 4 Juan anuncia 3 cosas que va a revelar más adelante y CUÁNDO ("en el minuto 42 les muestro el saldo exacto de mi cuenta"). El cerebro odia los loops abiertos — se queda a cerrarlos.</w:t>
       </w:r>
     </w:p>
     <w:p>
       <w:pPr>
-        <w:pStyle w:val="ListNumber"/>
-        <w:spacing w:before="40" w:after="40"/>
-      </w:pPr>
-      <w:r/>
+        <w:spacing w:before="60" w:after="80"/>
+      </w:pPr>
       <w:r>
-        <w:rPr>
-          <w:b/>
-        </w:rPr>
-        <w:t>App como Tarea de Cierre (Cero fuga de audiencia)</w:t>
-      </w:r>
-      <w:r>
-        <w:t xml:space="preserve">: la dinámica en la GENOMA App (`taller.ingresarios.net/app`) NUNCA se hace a mitad del live. Se demuestra en pantalla en el minuto 38 y se entrega como la </w:t>
+        <w:t xml:space="preserve">• </w:t>
       </w:r>
       <w:r>
         <w:rPr>
           <w:b/>
         </w:rPr>
-        <w:t>Misión Nocturna</w:t>
+        <w:t>Puntos de Control en juego</w:t>
       </w:r>
       <w:r>
-        <w:t xml:space="preserve"> de cierre en el minuto 42 para no perder retención.</w:t>
+        <w:t>: la asistencia completa paga 25 PC y el quiz relámpago del minuto 36 paga hasta 20 PC extra. Irse temprano cuesta puntos — y el leaderboard es público.</w:t>
       </w:r>
     </w:p>
     <w:p>
       <w:pPr>
-        <w:pStyle w:val="ListNumber"/>
-        <w:spacing w:before="40" w:after="40"/>
-      </w:pPr>
-      <w:r/>
+        <w:spacing w:before="60" w:after="80"/>
+      </w:pPr>
+      <w:r>
+        <w:t xml:space="preserve">• </w:t>
+      </w:r>
       <w:r>
         <w:rPr>
           <w:b/>
         </w:rPr>
-        <w:t>Nombre propio en vivo</w:t>
+        <w:t>Nombre propio</w:t>
       </w:r>
       <w:r>
-        <w:t>: Juan lee nombres del chat y de los resultados de las encuestas en voz alta mínimo 8 veces por live. Ser visto y mencionado es el mayor motor de engagement en eventos digitales.</w:t>
+        <w:t>: Juan lee nombres del chat y de las encuestas en voz alta mínimo 8 veces por live. Ser visto es la droga de los eventos en vivo.</w:t>
       </w:r>
     </w:p>
     <w:p>
       <w:pPr>
-        <w:pStyle w:val="ListNumber"/>
-        <w:spacing w:before="40" w:after="40"/>
-      </w:pPr>
-      <w:r/>
+        <w:spacing w:before="60" w:after="80"/>
+      </w:pPr>
+      <w:r>
+        <w:t xml:space="preserve">• </w:t>
+      </w:r>
       <w:r>
         <w:rPr>
           <w:b/>
@@ -144,32 +140,24 @@
         <w:t>El chat nunca duerme</w:t>
       </w:r>
       <w:r>
-        <w:t>: un Community Manager (CM) fija la pregunta activa en el chat de YouTube cada vez que Juan la lanza y "siembra" respuestas en los primeros segundos si el chat arranca lento.</w:t>
+        <w:t>: un CM publica la pregunta activa en el chat cada vez que Juan la lanza, y "siembra" respuestas si el chat arranca frío.</w:t>
       </w:r>
     </w:p>
     <w:p>
       <w:pPr>
-        <w:pStyle w:val="ListNumber"/>
-        <w:spacing w:before="40" w:after="40"/>
-      </w:pPr>
-      <w:r/>
+        <w:spacing w:before="60" w:after="80"/>
+      </w:pPr>
       <w:r>
-        <w:rPr>
-          <w:b/>
-        </w:rPr>
-        <w:t>Encuestas simples y espaciadas en YouTube Studio</w:t>
-      </w:r>
-      <w:r>
-        <w:t xml:space="preserve">: YouTube solo permite 1 encuesta activa a la vez. En este guión hay solo </w:t>
+        <w:t xml:space="preserve">• </w:t>
       </w:r>
       <w:r>
         <w:rPr>
           <w:b/>
         </w:rPr>
-        <w:t>3 encuestas estratégicas</w:t>
+        <w:t>Votar es quedarse</w:t>
       </w:r>
       <w:r>
-        <w:t xml:space="preserve"> espaciadas cada 15 minutos para darle tiempo al equipo de cargarlas sin estrés técnico.</w:t>
+        <w:t>: las encuestas de YouTube se lanzan ANTES de explicar el tema, no después. El que vota ya invirtió — se queda a ver el resultado.</w:t>
       </w:r>
     </w:p>
     <w:p>
@@ -182,7 +170,7 @@
           <w:color w:val="0F172A"/>
           <w:sz w:val="30"/>
         </w:rPr>
-        <w:t>Mapa del Live (YouTube Live — 45 Minutos)</w:t>
+        <w:t>Mapa del live (YouTube Live — 45 Minutos)</w:t>
       </w:r>
     </w:p>
     <w:tbl>
@@ -278,7 +266,7 @@
                 <w:color w:val="FFFFFF"/>
                 <w:sz w:val="19"/>
               </w:rPr>
-              <w:t>Interacción en YouTube Live</w:t>
+              <w:t>Interacción</w:t>
             </w:r>
           </w:p>
         </w:tc>
@@ -308,7 +296,7 @@
               <w:rPr>
                 <w:sz w:val="19"/>
               </w:rPr>
-              <w:t>-10:00 $\rightarrow$ 0:00</w:t>
+              <w:t>-10:00 → 0:00</w:t>
             </w:r>
           </w:p>
         </w:tc>
@@ -336,7 +324,7 @@
               <w:rPr>
                 <w:sz w:val="19"/>
               </w:rPr>
-              <w:t>**Encuesta 1 (YouTube)**: *¿Cuánto llevas operando?* + Chat de ciudades</w:t>
+              <w:t>Encuesta 1 (YouTube) abierta + chat de ciudades</w:t>
             </w:r>
           </w:p>
         </w:tc>
@@ -366,7 +354,7 @@
               <w:rPr>
                 <w:sz w:val="19"/>
               </w:rPr>
-              <w:t>0:00 $\rightarrow$ 3:30</w:t>
+              <w:t>0:00 → 3:30</w:t>
             </w:r>
           </w:p>
         </w:tc>
@@ -380,7 +368,7 @@
               <w:rPr>
                 <w:sz w:val="19"/>
               </w:rPr>
-              <w:t>Hook: -$47,300. Presentación oficial de Juan Villegas</w:t>
+              <w:t>Hook: -$47,300</w:t>
             </w:r>
           </w:p>
         </w:tc>
@@ -394,7 +382,7 @@
               <w:rPr>
                 <w:sz w:val="19"/>
               </w:rPr>
-              <w:t>**Chat Storm #1**: *"PRESENTE"* + Ciudad (+10 PC)</w:t>
+              <w:t>Chat: "PRESENTE" + Primera Campana (+10 PC)</w:t>
             </w:r>
           </w:p>
         </w:tc>
@@ -410,7 +398,7 @@
               <w:rPr>
                 <w:sz w:val="19"/>
               </w:rPr>
-              <w:t>**B2 · El Contrato**</w:t>
+              <w:t>**B2 · El contrato**</w:t>
             </w:r>
           </w:p>
         </w:tc>
@@ -424,7 +412,7 @@
               <w:rPr>
                 <w:sz w:val="19"/>
               </w:rPr>
-              <w:t>3:30 $\rightarrow$ 7:00</w:t>
+              <w:t>3:30 → 7:00</w:t>
             </w:r>
           </w:p>
         </w:tc>
@@ -438,7 +426,7 @@
               <w:rPr>
                 <w:sz w:val="19"/>
               </w:rPr>
-              <w:t>Promesa del live + 3 open loops + reglas</w:t>
+              <w:t>Promesa + 3 open loops + reglas</w:t>
             </w:r>
           </w:p>
         </w:tc>
@@ -452,7 +440,7 @@
               <w:rPr>
                 <w:sz w:val="19"/>
               </w:rPr>
-              <w:t>Comentarios sobre resultado de Encuesta 1</w:t>
+              <w:t>Comentario resultado Encuesta 1</w:t>
             </w:r>
           </w:p>
         </w:tc>
@@ -468,7 +456,7 @@
               <w:rPr>
                 <w:sz w:val="19"/>
               </w:rPr>
-              <w:t>**B3 · Dos Traders**</w:t>
+              <w:t>**B3 · Dos traders**</w:t>
             </w:r>
           </w:p>
         </w:tc>
@@ -482,7 +470,7 @@
               <w:rPr>
                 <w:sz w:val="19"/>
               </w:rPr>
-              <w:t>7:00 $\rightarrow$ 13:00</w:t>
+              <w:t>7:00 → 13:00</w:t>
             </w:r>
           </w:p>
         </w:tc>
@@ -496,7 +484,7 @@
               <w:rPr>
                 <w:sz w:val="19"/>
               </w:rPr>
-              <w:t>Historia Carlos vs. Andrés — La tesis central</w:t>
+              <w:t>Historia Carlos vs. Andrés — la tesis</w:t>
             </w:r>
           </w:p>
         </w:tc>
@@ -510,7 +498,7 @@
               <w:rPr>
                 <w:sz w:val="19"/>
               </w:rPr>
-              <w:t>**Chat Storm #2**: *"¿Eres CARLOS o ANDRÉS?"*</w:t>
+              <w:t>Chat storm: "¿cuál eres tú?"</w:t>
             </w:r>
           </w:p>
         </w:tc>
@@ -526,7 +514,7 @@
               <w:rPr>
                 <w:sz w:val="19"/>
               </w:rPr>
-              <w:t>**B4 · La Ciencia**</w:t>
+              <w:t>**B4 · La ciencia**</w:t>
             </w:r>
           </w:p>
         </w:tc>
@@ -540,7 +528,7 @@
               <w:rPr>
                 <w:sz w:val="19"/>
               </w:rPr>
-              <w:t>13:00 $\rightarrow$ 19:00</w:t>
+              <w:t>13:00 → 19:00</w:t>
             </w:r>
           </w:p>
         </w:tc>
@@ -568,7 +556,7 @@
               <w:rPr>
                 <w:sz w:val="19"/>
               </w:rPr>
-              <w:t>Explicación de Kahneman &amp; Tversky en formato historia</w:t>
+              <w:t>Explicación Kahneman / Dopamina / Secuestro emocional</w:t>
             </w:r>
           </w:p>
         </w:tc>
@@ -584,7 +572,7 @@
               <w:rPr>
                 <w:sz w:val="19"/>
               </w:rPr>
-              <w:t>**B5 · Los 4 Arquetipos**</w:t>
+              <w:t>**B5 · Los 4 arquetipos**</w:t>
             </w:r>
           </w:p>
         </w:tc>
@@ -598,7 +586,7 @@
               <w:rPr>
                 <w:sz w:val="19"/>
               </w:rPr>
-              <w:t>19:00 $\rightarrow$ 28:00</w:t>
+              <w:t>19:00 → 28:00</w:t>
             </w:r>
           </w:p>
         </w:tc>
@@ -626,7 +614,7 @@
               <w:rPr>
                 <w:sz w:val="19"/>
               </w:rPr>
-              <w:t>**Encuesta 2 (YouTube)**: *¿Cuál Saboteador operó tu cuenta?* + Chat de frases</w:t>
+              <w:t>ENCUESTA 2 (YouTube) + chat de frases</w:t>
             </w:r>
           </w:p>
         </w:tc>
@@ -642,7 +630,7 @@
               <w:rPr>
                 <w:sz w:val="19"/>
               </w:rPr>
-              <w:t>**B6 · Cómo se le Gana**</w:t>
+              <w:t>**B6 · Cómo se le gana**</w:t>
             </w:r>
           </w:p>
         </w:tc>
@@ -656,7 +644,7 @@
               <w:rPr>
                 <w:sz w:val="19"/>
               </w:rPr>
-              <w:t>28:00 $\rightarrow$ 33:00</w:t>
+              <w:t>28:00 → 33:00</w:t>
             </w:r>
           </w:p>
         </w:tc>
@@ -670,7 +658,7 @@
               <w:rPr>
                 <w:sz w:val="19"/>
               </w:rPr>
-              <w:t>Fuerza de voluntad vs. Sistema. Presentación del Método PEDEM</w:t>
+              <w:t>Fuerza de voluntad vs. sistema. Adelanto PEDEM</w:t>
             </w:r>
           </w:p>
         </w:tc>
@@ -684,7 +672,7 @@
               <w:rPr>
                 <w:sz w:val="19"/>
               </w:rPr>
-              <w:t>**Chat Storm #3**: *"SISTEMA"* + Mini-compromiso</w:t>
+              <w:t>Chat: "SISTEMA" + mini-compromiso</w:t>
             </w:r>
           </w:p>
         </w:tc>
@@ -700,7 +688,7 @@
               <w:rPr>
                 <w:sz w:val="19"/>
               </w:rPr>
-              <w:t>**B7 · El Juego**</w:t>
+              <w:t>**B7 · El juego**</w:t>
             </w:r>
           </w:p>
         </w:tc>
@@ -714,7 +702,7 @@
               <w:rPr>
                 <w:sz w:val="19"/>
               </w:rPr>
-              <w:t>33:00 $\rightarrow$ 38:00</w:t>
+              <w:t>33:00 → 38:00</w:t>
             </w:r>
           </w:p>
         </w:tc>
@@ -728,7 +716,7 @@
               <w:rPr>
                 <w:sz w:val="19"/>
               </w:rPr>
-              <w:t>Gamificación: Puntos de Control, Rangos, Becas y Círculos</w:t>
+              <w:t>Lanzamiento de la gamificación + QUIZ EN CHAT</w:t>
             </w:r>
           </w:p>
         </w:tc>
@@ -742,7 +730,7 @@
               <w:rPr>
                 <w:sz w:val="19"/>
               </w:rPr>
-              <w:t>**Pregunta Relámpago en Chat**: Juan premia a los 3 primeros en responder</w:t>
+              <w:t>Pregunta relámpago en chat (hasta 20 PC)</w:t>
             </w:r>
           </w:p>
         </w:tc>
@@ -758,7 +746,7 @@
               <w:rPr>
                 <w:sz w:val="19"/>
               </w:rPr>
-              <w:t>**B8 · Demo del Test**</w:t>
+              <w:t>**B8 · El entrenamiento**</w:t>
             </w:r>
           </w:p>
         </w:tc>
@@ -772,7 +760,7 @@
               <w:rPr>
                 <w:sz w:val="19"/>
               </w:rPr>
-              <w:t>38:00 $\rightarrow$ 42:00</w:t>
+              <w:t>38:00 → 42:00</w:t>
             </w:r>
           </w:p>
         </w:tc>
@@ -786,7 +774,7 @@
               <w:rPr>
                 <w:sz w:val="19"/>
               </w:rPr>
-              <w:t>Demo en vivo en pantalla de la GENOMA App y la Card de Resultado</w:t>
+              <w:t>Test del Saboteador: demo en vivo de la card</w:t>
             </w:r>
           </w:p>
         </w:tc>
@@ -800,7 +788,7 @@
               <w:rPr>
                 <w:sz w:val="19"/>
               </w:rPr>
-              <w:t>**Screen Share**: Juan muestra su Card *"MI SABOTEADOR ES EL VENGADOR"*</w:t>
+              <w:t>Screen Share de la App en pantalla</w:t>
             </w:r>
           </w:p>
         </w:tc>
@@ -816,7 +804,7 @@
               <w:rPr>
                 <w:sz w:val="19"/>
               </w:rPr>
-              <w:t>**B9 · Cierre &amp; Tarea**</w:t>
+              <w:t>**B9 · El cliffhanger**</w:t>
             </w:r>
           </w:p>
         </w:tc>
@@ -830,7 +818,7 @@
               <w:rPr>
                 <w:sz w:val="19"/>
               </w:rPr>
-              <w:t>42:00 $\rightarrow$ 45:00</w:t>
+              <w:t>42:00 → 45:00</w:t>
             </w:r>
           </w:p>
         </w:tc>
@@ -844,7 +832,7 @@
               <w:rPr>
                 <w:sz w:val="19"/>
               </w:rPr>
-              <w:t>Cliffhanger de la cuenta real de mañana + CTA a la App</w:t>
+              <w:t>La cuenta real de mañana + cierre</w:t>
             </w:r>
           </w:p>
         </w:tc>
@@ -858,7 +846,7 @@
               <w:rPr>
                 <w:sz w:val="19"/>
               </w:rPr>
-              <w:t>**Encuesta 3 (YouTube)** + **Chat Storm #4**: *"NOS VEMOS"* + Link a la App</w:t>
+              <w:t>ENCUESTA 3 (YouTube) + Chat final: "NOS VEMOS" + Link a la App</w:t>
             </w:r>
           </w:p>
         </w:tc>
@@ -875,7 +863,7 @@
           <w:color w:val="0F172A"/>
           <w:sz w:val="30"/>
         </w:rPr>
-        <w:t>El Guión, Minuto a Minuto</w:t>
+        <w:t>El guión, minuto a minuto</w:t>
       </w:r>
     </w:p>
     <w:p>
@@ -888,7 +876,20 @@
           <w:color w:val="2563EB"/>
           <w:sz w:val="26"/>
         </w:rPr>
-        <w:t>-10:00 $\rightarrow$ 0:00 | B0 · PRE-SHOW — La sala se calienta sola</w:t>
+        <w:t>-10:00 → 0:00</w:t>
+      </w:r>
+    </w:p>
+    <w:p>
+      <w:pPr>
+        <w:spacing w:before="240" w:after="80"/>
+      </w:pPr>
+      <w:r>
+        <w:rPr>
+          <w:b/>
+          <w:color w:val="2563EB"/>
+          <w:sz w:val="26"/>
+        </w:rPr>
+        <w:t>B0 · PRE-SHOW — la sala se calienta sola</w:t>
       </w:r>
     </w:p>
     <w:p>
@@ -903,92 +904,23 @@
         <w:t>EN PANTALLA:</w:t>
       </w:r>
       <w:r>
-        <w:t xml:space="preserve"> Countdown gigante + música motivadora + banner inferior: *"Encuesta abierta en el chat de YouTube + QR del link de referidos"*.</w:t>
+        <w:t xml:space="preserve"> Countdown gigante + música + banner: *"Encuesta abierta en el chat de YouTube: ¿cuánto llevas operando? + QR del link de referidos"*</w:t>
       </w:r>
     </w:p>
     <w:p>
       <w:pPr>
-        <w:spacing w:before="80" w:after="80"/>
-        <w:ind w:left="576"/>
-      </w:pPr>
+        <w:spacing w:before="60" w:after="80"/>
+      </w:pPr>
+      <w:r>
+        <w:t xml:space="preserve">⚡ </w:t>
+      </w:r>
       <w:r>
         <w:rPr>
-          <w:i/>
-          <w:color w:val="334155"/>
-          <w:sz w:val="21"/>
+          <w:b/>
         </w:rPr>
-        <w:t>⚡ ENCUESTA 1 (YOUTUBE LIVE — ABIERTA DESDE EL MINUTO -10)</w:t>
+        <w:t>ENCUESTA 1 (YOUTUBE LIVE — ABIERTA DESDE EL MINUTO -10)</w:t>
       </w:r>
-    </w:p>
-    <w:p>
-      <w:pPr>
-        <w:spacing w:before="80" w:after="80"/>
-        <w:ind w:left="576"/>
-      </w:pPr>
-      <w:r>
-        <w:rPr>
-          <w:i/>
-          <w:color w:val="334155"/>
-          <w:sz w:val="21"/>
-        </w:rPr>
-        <w:t>“¿Cuánto llevas intentando ganarle al mercado?”</w:t>
-      </w:r>
-    </w:p>
-    <w:p>
-      <w:pPr>
-        <w:spacing w:before="80" w:after="80"/>
-        <w:ind w:left="576"/>
-      </w:pPr>
-      <w:r>
-        <w:rPr>
-          <w:i/>
-          <w:color w:val="334155"/>
-          <w:sz w:val="21"/>
-        </w:rPr>
-        <w:t>- A) Todavía no empiezo — vengo a aprender antes de quemarme</w:t>
-      </w:r>
-    </w:p>
-    <w:p>
-      <w:pPr>
-        <w:spacing w:before="80" w:after="80"/>
-        <w:ind w:left="576"/>
-      </w:pPr>
-      <w:r>
-        <w:rPr>
-          <w:i/>
-          <w:color w:val="334155"/>
-          <w:sz w:val="21"/>
-        </w:rPr>
-        <w:t>- B) Menos de 1 año</w:t>
-      </w:r>
-    </w:p>
-    <w:p>
-      <w:pPr>
-        <w:spacing w:before="80" w:after="80"/>
-        <w:ind w:left="576"/>
-      </w:pPr>
-      <w:r>
-        <w:rPr>
-          <w:i/>
-          <w:color w:val="334155"/>
-          <w:sz w:val="21"/>
-        </w:rPr>
-        <w:t>- C) 1 a 3 años</w:t>
-      </w:r>
-    </w:p>
-    <w:p>
-      <w:pPr>
-        <w:spacing w:before="80" w:after="80"/>
-        <w:ind w:left="576"/>
-      </w:pPr>
-      <w:r>
-        <w:rPr>
-          <w:i/>
-          <w:color w:val="334155"/>
-          <w:sz w:val="21"/>
-        </w:rPr>
-        <w:t>- D) Más de 3 años (y sé exactamente por qué estoy aquí)</w:t>
-      </w:r>
+      <w:r/>
     </w:p>
     <w:p>
       <w:pPr>
@@ -999,10 +931,55 @@
         <w:rPr>
           <w:b/>
         </w:rPr>
-        <w:t>CM en el chat de YouTube:</w:t>
+        <w:t>“¿Cuánto llevas intentando ganarle al mercado?”</w:t>
+      </w:r>
+      <w:r/>
+    </w:p>
+    <w:p>
+      <w:pPr>
+        <w:spacing w:before="60" w:after="80"/>
+      </w:pPr>
+      <w:r>
+        <w:t>A) Todavía no empiezo — vengo a aprender antes de quemarme</w:t>
+      </w:r>
+    </w:p>
+    <w:p>
+      <w:pPr>
+        <w:spacing w:before="60" w:after="80"/>
+      </w:pPr>
+      <w:r>
+        <w:t>B) Menos de 1 año</w:t>
+      </w:r>
+    </w:p>
+    <w:p>
+      <w:pPr>
+        <w:spacing w:before="60" w:after="80"/>
+      </w:pPr>
+      <w:r>
+        <w:t>C) 1 a 3 años</w:t>
+      </w:r>
+    </w:p>
+    <w:p>
+      <w:pPr>
+        <w:spacing w:before="60" w:after="80"/>
+      </w:pPr>
+      <w:r>
+        <w:t>D) Más de 3 años (y sé exactamente por qué estoy aquí)</w:t>
+      </w:r>
+    </w:p>
+    <w:p>
+      <w:pPr>
+        <w:spacing w:before="60" w:after="80"/>
+      </w:pPr>
+      <w:r/>
+      <w:r>
+        <w:rPr>
+          <w:b/>
+        </w:rPr>
+        <w:t>CM en el chat:</w:t>
       </w:r>
       <w:r>
-        <w:t xml:space="preserve"> *"Escribe tu CIUDAD + cuánto llevas operando. Juan lee los mejores comentarios al empezar."* El CM saluda por nombre a cada persona que escribe en el chat.</w:t>
+        <w:t xml:space="preserve"> “Escribe tu CIUDAD + cuánto llevas operando. Juan lee las mejores al empezar.” El CM saluda por nombre a cada persona que escribe. Si el chat está frío, dos cuentas del equipo siembran respuestas.</w:t>
       </w:r>
     </w:p>
     <w:p>
@@ -1015,7 +992,20 @@
           <w:color w:val="2563EB"/>
           <w:sz w:val="26"/>
         </w:rPr>
-        <w:t>0:00 $\rightarrow$ 3:30 | B1 · LA CAMPANA — El Hook</w:t>
+        <w:t>0:00 → 3:30</w:t>
+      </w:r>
+    </w:p>
+    <w:p>
+      <w:pPr>
+        <w:spacing w:before="240" w:after="80"/>
+      </w:pPr>
+      <w:r>
+        <w:rPr>
+          <w:b/>
+          <w:color w:val="2563EB"/>
+          <w:sz w:val="26"/>
+        </w:rPr>
+        <w:t>B1 · LA CAMPANA — el hook</w:t>
       </w:r>
     </w:p>
     <w:p>
@@ -1030,7 +1020,7 @@
         <w:t>EN PANTALLA:</w:t>
       </w:r>
       <w:r>
-        <w:t xml:space="preserve"> Corte a negro. Un número gigante aparece en tipografía roja neón: </w:t>
+        <w:t xml:space="preserve"> Corte a negro. Un número gigante aparece: </w:t>
       </w:r>
       <w:r>
         <w:rPr>
@@ -1047,34 +1037,14 @@
         <w:spacing w:before="60" w:after="80"/>
       </w:pPr>
       <w:r>
-        <w:t>*(Sin "hola, bienvenidos". Directo, mirando a cámara)*</w:t>
+        <w:t>*(Sin “hola, bienvenidos”. Directo, mirando a cámara)*</w:t>
       </w:r>
     </w:p>
     <w:p>
       <w:pPr>
-        <w:spacing w:before="80" w:after="80"/>
-        <w:ind w:left="576"/>
+        <w:spacing w:before="60" w:after="80"/>
       </w:pPr>
       <w:r>
-        <w:rPr>
-          <w:i/>
-          <w:color w:val="334155"/>
-          <w:sz w:val="21"/>
-        </w:rPr>
-        <w:t>Juan Villegas:</w:t>
-      </w:r>
-    </w:p>
-    <w:p>
-      <w:pPr>
-        <w:spacing w:before="80" w:after="80"/>
-        <w:ind w:left="576"/>
-      </w:pPr>
-      <w:r>
-        <w:rPr>
-          <w:i/>
-          <w:color w:val="334155"/>
-          <w:sz w:val="21"/>
-        </w:rPr>
         <w:t>“Ese número es real.</w:t>
       </w:r>
     </w:p>
@@ -1083,34 +1053,14 @@
         <w:spacing w:before="60" w:after="80"/>
       </w:pPr>
       <w:r>
-        <w:t>&gt;</w:t>
-      </w:r>
-    </w:p>
-    <w:p>
-      <w:pPr>
-        <w:spacing w:before="80" w:after="80"/>
-        <w:ind w:left="576"/>
-      </w:pPr>
-      <w:r>
-        <w:rPr>
-          <w:i/>
-          <w:color w:val="334155"/>
-          <w:sz w:val="21"/>
-        </w:rPr>
         <w:t>Es lo que me costó un solo empleado que trabajó para mí durante años.</w:t>
       </w:r>
     </w:p>
     <w:p>
       <w:pPr>
-        <w:spacing w:before="80" w:after="80"/>
-        <w:ind w:left="576"/>
+        <w:spacing w:before="60" w:after="80"/>
       </w:pPr>
       <w:r>
-        <w:rPr>
-          <w:i/>
-          <w:color w:val="334155"/>
-          <w:sz w:val="21"/>
-        </w:rPr>
         <w:t>Sin sueldo. Sin contrato. Sin que yo supiera que existía.</w:t>
       </w:r>
     </w:p>
@@ -1119,34 +1069,14 @@
         <w:spacing w:before="60" w:after="80"/>
       </w:pPr>
       <w:r>
-        <w:t>&gt;</w:t>
-      </w:r>
-    </w:p>
-    <w:p>
-      <w:pPr>
-        <w:spacing w:before="80" w:after="80"/>
-        <w:ind w:left="576"/>
-      </w:pPr>
-      <w:r>
-        <w:rPr>
-          <w:i/>
-          <w:color w:val="334155"/>
-          <w:sz w:val="21"/>
-        </w:rPr>
         <w:t>Operaba mi cuenta cuando yo estaba cansado. Cuando venía de perder.</w:t>
       </w:r>
     </w:p>
     <w:p>
       <w:pPr>
-        <w:spacing w:before="80" w:after="80"/>
-        <w:ind w:left="576"/>
+        <w:spacing w:before="60" w:after="80"/>
       </w:pPr>
       <w:r>
-        <w:rPr>
-          <w:i/>
-          <w:color w:val="334155"/>
-          <w:sz w:val="21"/>
-        </w:rPr>
         <w:t>Cuando venía de ganar — sobre todo cuando venía de ganar.</w:t>
       </w:r>
     </w:p>
@@ -1155,34 +1085,14 @@
         <w:spacing w:before="60" w:after="80"/>
       </w:pPr>
       <w:r>
-        <w:t>&gt;</w:t>
-      </w:r>
-    </w:p>
-    <w:p>
-      <w:pPr>
-        <w:spacing w:before="80" w:after="80"/>
-        <w:ind w:left="576"/>
-      </w:pPr>
-      <w:r>
-        <w:rPr>
-          <w:i/>
-          <w:color w:val="334155"/>
-          <w:sz w:val="21"/>
-        </w:rPr>
         <w:t>Y lo más incómodo de admitir: yo sabía análisis técnico. Llevaba décadas en mercados institucionales. Terminales Bloomberg, mesas de dinero, todo.</w:t>
       </w:r>
     </w:p>
     <w:p>
       <w:pPr>
-        <w:spacing w:before="80" w:after="80"/>
-        <w:ind w:left="576"/>
+        <w:spacing w:before="60" w:after="80"/>
       </w:pPr>
       <w:r>
-        <w:rPr>
-          <w:i/>
-          <w:color w:val="334155"/>
-          <w:sz w:val="21"/>
-        </w:rPr>
         <w:t>Porque el problema nunca fue el conocimiento. Era quién lo ejecutaba.</w:t>
       </w:r>
     </w:p>
@@ -1191,35 +1101,15 @@
         <w:spacing w:before="60" w:after="80"/>
       </w:pPr>
       <w:r>
-        <w:t>&gt;</w:t>
-      </w:r>
-    </w:p>
-    <w:p>
-      <w:pPr>
-        <w:spacing w:before="80" w:after="80"/>
-        <w:ind w:left="576"/>
-      </w:pPr>
-      <w:r>
-        <w:rPr>
-          <w:i/>
-          <w:color w:val="334155"/>
-          <w:sz w:val="21"/>
-        </w:rPr>
         <w:t>Esta noche le vas a poner nombre al tuyo. Y te advierto una cosa:</w:t>
       </w:r>
     </w:p>
     <w:p>
       <w:pPr>
-        <w:spacing w:before="80" w:after="80"/>
-        <w:ind w:left="576"/>
+        <w:spacing w:before="60" w:after="80"/>
       </w:pPr>
       <w:r>
-        <w:rPr>
-          <w:i/>
-          <w:color w:val="334155"/>
-          <w:sz w:val="21"/>
-        </w:rPr>
-        <w:t>el test que vas a hacer al final en nuestra app no perdona. Te vas a reconocer.”</w:t>
+        <w:t>el test que vas a hacer al final no perdona. Te vas a reconocer.”</w:t>
       </w:r>
     </w:p>
     <w:p>
@@ -1227,99 +1117,78 @@
         <w:spacing w:before="60" w:after="80"/>
       </w:pPr>
       <w:r>
-        <w:t>*(Pausa de 2 segundos. Cambia el tono: energía de bienvenida)*</w:t>
+        <w:t>*(Pausa de 2 segundos. Cambia el tono: ahora sí, energía de bienvenida)*</w:t>
       </w:r>
     </w:p>
     <w:p>
       <w:pPr>
-        <w:spacing w:before="80" w:after="80"/>
-        <w:ind w:left="576"/>
-      </w:pPr>
+        <w:spacing w:before="60" w:after="80"/>
+      </w:pPr>
+      <w:r>
+        <w:t xml:space="preserve">“Bienvenidos al Juego Mental del Dinero. Soy </w:t>
+      </w:r>
       <w:r>
         <w:rPr>
-          <w:i/>
-          <w:color w:val="334155"/>
-          <w:sz w:val="21"/>
+          <w:b/>
         </w:rPr>
-        <w:t>Juan Villegas:</w:t>
+        <w:t>Juan Villegas</w:t>
+      </w:r>
+      <w:r>
+        <w:t xml:space="preserve"> y esto no es un curso — es un juego que se juega para ganar.</w:t>
       </w:r>
     </w:p>
     <w:p>
       <w:pPr>
-        <w:spacing w:before="80" w:after="80"/>
-        <w:ind w:left="576"/>
+        <w:spacing w:before="60" w:after="80"/>
       </w:pPr>
       <w:r>
-        <w:rPr>
-          <w:i/>
-          <w:color w:val="334155"/>
-          <w:sz w:val="21"/>
-        </w:rPr>
-        <w:t>“Bienvenidos al Juego Mental del Dinero. Soy Juan Villegas y esto no es un curso — es un juego que se juega para ganar.</w:t>
+        <w:t>Los que llegaron en los primeros 5 minutos ya tienen 35 Puntos de Control.</w:t>
       </w:r>
     </w:p>
     <w:p>
       <w:pPr>
-        <w:spacing w:before="80" w:after="80"/>
-        <w:ind w:left="576"/>
+        <w:spacing w:before="60" w:after="80"/>
       </w:pPr>
       <w:r>
-        <w:rPr>
-          <w:i/>
-          <w:color w:val="334155"/>
-          <w:sz w:val="21"/>
-        </w:rPr>
-        <w:t>Los que llegaron en los primeros 5 minutos ya tienen 35 Puntos de Control acumulados. La Primera Campana ya pagó.”</w:t>
+        <w:t>La Primera Campana ya pagó.”</w:t>
       </w:r>
     </w:p>
     <w:p>
       <w:pPr>
-        <w:spacing w:before="80" w:after="80"/>
-        <w:ind w:left="576"/>
-      </w:pPr>
+        <w:spacing w:before="60" w:after="80"/>
+      </w:pPr>
+      <w:r>
+        <w:t xml:space="preserve">⚡ </w:t>
+      </w:r>
       <w:r>
         <w:rPr>
-          <w:i/>
-          <w:color w:val="334155"/>
-          <w:sz w:val="21"/>
+          <w:b/>
         </w:rPr>
-        <w:t>⚡ CHAT STORM #1 (MINUTO 2:45)</w:t>
+        <w:t>CHAT STORM #1 (MINUTO 2:45)</w:t>
+      </w:r>
+      <w:r/>
+    </w:p>
+    <w:p>
+      <w:pPr>
+        <w:spacing w:before="60" w:after="80"/>
+      </w:pPr>
+      <w:r/>
+      <w:r>
+        <w:rPr>
+          <w:b/>
+        </w:rPr>
+        <w:t>Juan:</w:t>
+      </w:r>
+      <w:r>
+        <w:t xml:space="preserve"> “Escriban PRESENTE en el chat si están en vivo, con la ciudad. Quiero ver de dónde nos acompañan.”</w:t>
       </w:r>
     </w:p>
     <w:p>
       <w:pPr>
-        <w:spacing w:before="80" w:after="80"/>
-        <w:ind w:left="576"/>
+        <w:spacing w:before="60" w:after="80"/>
       </w:pPr>
       <w:r>
-        <w:rPr>
-          <w:i/>
-          <w:color w:val="334155"/>
-          <w:sz w:val="21"/>
-        </w:rPr>
-        <w:t>Juan Villegas: “Escriban PRESENTE en el chat de YouTube si están en vivo, junto con su ciudad. Quiero ver de dónde nos acompañan hoy.”</w:t>
-      </w:r>
-    </w:p>
-    <w:p>
-      <w:pPr>
-        <w:spacing w:before="60" w:after="80"/>
-      </w:pPr>
-      <w:r>
-        <w:t>&gt;</w:t>
-      </w:r>
-    </w:p>
-    <w:p>
-      <w:pPr>
-        <w:spacing w:before="80" w:after="80"/>
-        <w:ind w:left="576"/>
-      </w:pPr>
-      <w:r>
-        <w:rPr>
-          <w:i/>
-          <w:color w:val="334155"/>
-          <w:sz w:val="21"/>
-        </w:rPr>
-        <w:t>*Juan lee 4–5 ciudades y nombres en voz alta:* “Medellín, Bogotá, CDMX, Miami, Lima... esto ya parece una mesa de dinero latinoamericana.”</w:t>
+        <w:t>Juan lee 4–5 ciudades y nombres en voz alta. “Medellín, Bogotá, CDMX, Miami... esto ya parece una mesa de dinero latinoamericana.”</w:t>
       </w:r>
     </w:p>
     <w:p>
@@ -1332,7 +1201,20 @@
           <w:color w:val="2563EB"/>
           <w:sz w:val="26"/>
         </w:rPr>
-        <w:t>3:30 $\rightarrow$ 7:00 | B2 · EL CONTRATO — Promesa y Open Loops</w:t>
+        <w:t>3:30 → 7:00</w:t>
+      </w:r>
+    </w:p>
+    <w:p>
+      <w:pPr>
+        <w:spacing w:before="240" w:after="80"/>
+      </w:pPr>
+      <w:r>
+        <w:rPr>
+          <w:b/>
+          <w:color w:val="2563EB"/>
+          <w:sz w:val="26"/>
+        </w:rPr>
+        <w:t>B2 · EL CONTRATO — promesa y open loops</w:t>
       </w:r>
     </w:p>
     <w:p>
@@ -1347,56 +1229,22 @@
         <w:t>EN PANTALLA:</w:t>
       </w:r>
       <w:r>
-        <w:t xml:space="preserve"> Slide: *"LOS PRÓXIMOS 45 MINUTOS"* con 3 bullets que se revelan uno a uno.</w:t>
+        <w:t xml:space="preserve"> Slide: *"LOS PRÓXIMOS 45 MINUTOS"* con 3 bullets que se revelan uno a uno</w:t>
       </w:r>
     </w:p>
     <w:p>
       <w:pPr>
-        <w:spacing w:before="80" w:after="80"/>
-        <w:ind w:left="576"/>
+        <w:spacing w:before="60" w:after="80"/>
       </w:pPr>
       <w:r>
-        <w:rPr>
-          <w:i/>
-          <w:color w:val="334155"/>
-          <w:sz w:val="21"/>
-        </w:rPr>
-        <w:t>Juan Villegas:</w:t>
+        <w:t>“Este es el contrato de esta noche. En los próximos 45 minutos:</w:t>
       </w:r>
     </w:p>
     <w:p>
       <w:pPr>
-        <w:spacing w:before="80" w:after="80"/>
-        <w:ind w:left="576"/>
+        <w:spacing w:before="60" w:after="80"/>
       </w:pPr>
       <w:r>
-        <w:rPr>
-          <w:i/>
-          <w:color w:val="334155"/>
-          <w:sz w:val="21"/>
-        </w:rPr>
-        <w:t>“Este es el contrato de esta noche. En los próximos 40 minutos:</w:t>
-      </w:r>
-    </w:p>
-    <w:p>
-      <w:pPr>
-        <w:spacing w:before="60" w:after="80"/>
-      </w:pPr>
-      <w:r>
-        <w:t>&gt;</w:t>
-      </w:r>
-    </w:p>
-    <w:p>
-      <w:pPr>
-        <w:spacing w:before="80" w:after="80"/>
-        <w:ind w:left="576"/>
-      </w:pPr>
-      <w:r>
-        <w:rPr>
-          <w:i/>
-          <w:color w:val="334155"/>
-          <w:sz w:val="21"/>
-        </w:rPr>
         <w:t>Uno — vas a entender POR QUÉ pierdes dinero sabiendo lo que sabes. Y no es la respuesta que te han vendido. No necesitas otro indicador.</w:t>
       </w:r>
     </w:p>
@@ -1405,20 +1253,6 @@
         <w:spacing w:before="60" w:after="80"/>
       </w:pPr>
       <w:r>
-        <w:t>&gt;</w:t>
-      </w:r>
-    </w:p>
-    <w:p>
-      <w:pPr>
-        <w:spacing w:before="80" w:after="80"/>
-        <w:ind w:left="576"/>
-      </w:pPr>
-      <w:r>
-        <w:rPr>
-          <w:i/>
-          <w:color w:val="334155"/>
-          <w:sz w:val="21"/>
-        </w:rPr>
         <w:t>Dos — vas a conocer los 4 saboteadores que operan cuentas ajenas. Uno de ellos es el tuyo. Vamos a votar en vivo cuál es el más común de esta comunidad — mi apuesta: gana el Vengador. Ya veremos.</w:t>
       </w:r>
     </w:p>
@@ -1427,21 +1261,15 @@
         <w:spacing w:before="60" w:after="80"/>
       </w:pPr>
       <w:r>
-        <w:t>&gt;</w:t>
+        <w:t>Tres — al final te doy el test que le pone nombre y apellido al tuyo.</w:t>
       </w:r>
     </w:p>
     <w:p>
       <w:pPr>
-        <w:spacing w:before="80" w:after="80"/>
-        <w:ind w:left="576"/>
+        <w:spacing w:before="60" w:after="80"/>
       </w:pPr>
       <w:r>
-        <w:rPr>
-          <w:i/>
-          <w:color w:val="334155"/>
-          <w:sz w:val="21"/>
-        </w:rPr>
-        <w:t>Tres — al final te muestro en pantalla el test oficial que le pone nombre y apellido al tuyo para que lo hagas esta noche en la App.</w:t>
+        <w:t>Y en el minuto 42 voy a hacer algo que no hace ningún educador de este mercado: les voy a decir exactamente qué van a ver mañana cuando abra mi cuenta real en pantalla. Con el saldo. Sin editar.</w:t>
       </w:r>
     </w:p>
     <w:p>
@@ -1449,42 +1277,6 @@
         <w:spacing w:before="60" w:after="80"/>
       </w:pPr>
       <w:r>
-        <w:t>&gt;</w:t>
-      </w:r>
-    </w:p>
-    <w:p>
-      <w:pPr>
-        <w:spacing w:before="80" w:after="80"/>
-        <w:ind w:left="576"/>
-      </w:pPr>
-      <w:r>
-        <w:rPr>
-          <w:i/>
-          <w:color w:val="334155"/>
-          <w:sz w:val="21"/>
-        </w:rPr>
-        <w:t>Y en el minuto 42 voy a hacer algo que no hace ningún educador de este mercado: les voy a decir exactamente qué van a ver mañana a las 7:00 PM cuando abra mi cuenta real en pantalla. Con el saldo. Sin editar.</w:t>
-      </w:r>
-    </w:p>
-    <w:p>
-      <w:pPr>
-        <w:spacing w:before="60" w:after="80"/>
-      </w:pPr>
-      <w:r>
-        <w:t>&gt;</w:t>
-      </w:r>
-    </w:p>
-    <w:p>
-      <w:pPr>
-        <w:spacing w:before="80" w:after="80"/>
-        <w:ind w:left="576"/>
-      </w:pPr>
-      <w:r>
-        <w:rPr>
-          <w:i/>
-          <w:color w:val="334155"/>
-          <w:sz w:val="21"/>
-        </w:rPr>
         <w:t>El que se va a mitad de camino se pierde las tres cosas. Quedamos claros.”</w:t>
       </w:r>
     </w:p>
@@ -1493,21 +1285,22 @@
         <w:spacing w:before="60" w:after="80"/>
       </w:pPr>
       <w:r>
-        <w:t>*Juan comenta en vivo la Encuesta #1 de YouTube:*</w:t>
+        <w:t xml:space="preserve">⚡ </w:t>
       </w:r>
+      <w:r>
+        <w:rPr>
+          <w:b/>
+        </w:rPr>
+        <w:t>COMENTARIO ENCUESTA 1 (MINUTO 5:30)</w:t>
+      </w:r>
+      <w:r/>
     </w:p>
     <w:p>
       <w:pPr>
-        <w:spacing w:before="80" w:after="80"/>
-        <w:ind w:left="576"/>
+        <w:spacing w:before="60" w:after="80"/>
       </w:pPr>
       <w:r>
-        <w:rPr>
-          <w:i/>
-          <w:color w:val="334155"/>
-          <w:sz w:val="21"/>
-        </w:rPr>
-        <w:t>“Miren los resultados de la encuesta en el chat: la mayoría está entre 1 y 3 años. Guarden ese dato — en 10 minutos van a entender exactamente por qué no han despegado.”</w:t>
+        <w:t>Juan comenta el resultado de la Encuesta #1 de YouTube en vivo: “Miren eso: la mayoría en B y C. Guarden ese dato — en 10 minutos van a entender exactamente por qué. No es lo que creen.”</w:t>
       </w:r>
     </w:p>
     <w:p>
@@ -1520,7 +1313,20 @@
           <w:color w:val="2563EB"/>
           <w:sz w:val="26"/>
         </w:rPr>
-        <w:t>7:00 $\rightarrow$ 13:00 | B3 · DOS TRADERS — La historia que instala la tesis</w:t>
+        <w:t>7:00 → 13:00</w:t>
+      </w:r>
+    </w:p>
+    <w:p>
+      <w:pPr>
+        <w:spacing w:before="240" w:after="80"/>
+      </w:pPr>
+      <w:r>
+        <w:rPr>
+          <w:b/>
+          <w:color w:val="2563EB"/>
+          <w:sz w:val="26"/>
+        </w:rPr>
+        <w:t>B3 · DOS TRADERS — la historia que instala la tesis</w:t>
       </w:r>
     </w:p>
     <w:p>
@@ -1535,62 +1341,30 @@
         <w:t>EN PANTALLA:</w:t>
       </w:r>
       <w:r>
-        <w:t xml:space="preserve"> Slide dividida en dos: *"CARLOS"* y *"ANDRÉS"* — dos siluetas idénticas.</w:t>
+        <w:t xml:space="preserve"> Slide dividida en dos: *"CARLOS"* y *"ANDRÉS"* — dos siluetas idénticas</w:t>
       </w:r>
     </w:p>
     <w:p>
       <w:pPr>
-        <w:spacing w:before="80" w:after="80"/>
-        <w:ind w:left="576"/>
+        <w:spacing w:before="60" w:after="80"/>
       </w:pPr>
       <w:r>
-        <w:rPr>
-          <w:i/>
-          <w:color w:val="334155"/>
-          <w:sz w:val="21"/>
-        </w:rPr>
-        <w:t>Juan Villegas:</w:t>
-      </w:r>
-    </w:p>
-    <w:p>
-      <w:pPr>
-        <w:spacing w:before="80" w:after="80"/>
-        <w:ind w:left="576"/>
-      </w:pPr>
-      <w:r>
-        <w:rPr>
-          <w:i/>
-          <w:color w:val="334155"/>
-          <w:sz w:val="21"/>
-        </w:rPr>
         <w:t>“Les voy a contar de dos personas que conocí en mis años de mesa.</w:t>
       </w:r>
     </w:p>
     <w:p>
       <w:pPr>
-        <w:spacing w:before="80" w:after="80"/>
-        <w:ind w:left="576"/>
+        <w:spacing w:before="60" w:after="80"/>
       </w:pPr>
       <w:r>
-        <w:rPr>
-          <w:i/>
-          <w:color w:val="334155"/>
-          <w:sz w:val="21"/>
-        </w:rPr>
         <w:t>Los voy a llamar Carlos y Andrés. Los dos ingenieros. Los dos brillantes.</w:t>
       </w:r>
     </w:p>
     <w:p>
       <w:pPr>
-        <w:spacing w:before="80" w:after="80"/>
-        <w:ind w:left="576"/>
+        <w:spacing w:before="60" w:after="80"/>
       </w:pPr>
       <w:r>
-        <w:rPr>
-          <w:i/>
-          <w:color w:val="334155"/>
-          <w:sz w:val="21"/>
-        </w:rPr>
         <w:t>Los dos aprendieron EXACTAMENTE la misma estrategia, el mismo año, del mismo mentor. Mismo capital inicial.</w:t>
       </w:r>
     </w:p>
@@ -1599,34 +1373,14 @@
         <w:spacing w:before="60" w:after="80"/>
       </w:pPr>
       <w:r>
-        <w:t>&gt;</w:t>
-      </w:r>
-    </w:p>
-    <w:p>
-      <w:pPr>
-        <w:spacing w:before="80" w:after="80"/>
-        <w:ind w:left="576"/>
-      </w:pPr>
-      <w:r>
-        <w:rPr>
-          <w:i/>
-          <w:color w:val="334155"/>
-          <w:sz w:val="21"/>
-        </w:rPr>
         <w:t>Cinco años después, Andrés vive de sus inversiones.</w:t>
       </w:r>
     </w:p>
     <w:p>
       <w:pPr>
-        <w:spacing w:before="80" w:after="80"/>
-        <w:ind w:left="576"/>
+        <w:spacing w:before="60" w:after="80"/>
       </w:pPr>
       <w:r>
-        <w:rPr>
-          <w:i/>
-          <w:color w:val="334155"/>
-          <w:sz w:val="21"/>
-        </w:rPr>
         <w:t>Carlos vendió su moto para pagar la tarjeta.</w:t>
       </w:r>
     </w:p>
@@ -1635,20 +1389,6 @@
         <w:spacing w:before="60" w:after="80"/>
       </w:pPr>
       <w:r>
-        <w:t>&gt;</w:t>
-      </w:r>
-    </w:p>
-    <w:p>
-      <w:pPr>
-        <w:spacing w:before="80" w:after="80"/>
-        <w:ind w:left="576"/>
-      </w:pPr>
-      <w:r>
-        <w:rPr>
-          <w:i/>
-          <w:color w:val="334155"/>
-          <w:sz w:val="21"/>
-        </w:rPr>
         <w:t>Y aquí está lo que nadie quiere escuchar: si comparas sus análisis de mercado — sus gráficos, sus zonas, sus tesis — los de Carlos eran MEJORES. Más completos. Más elegantes. Carlos sabía más.</w:t>
       </w:r>
     </w:p>
@@ -1657,20 +1397,6 @@
         <w:spacing w:before="60" w:after="80"/>
       </w:pPr>
       <w:r>
-        <w:t>&gt;</w:t>
-      </w:r>
-    </w:p>
-    <w:p>
-      <w:pPr>
-        <w:spacing w:before="80" w:after="80"/>
-        <w:ind w:left="576"/>
-      </w:pPr>
-      <w:r>
-        <w:rPr>
-          <w:i/>
-          <w:color w:val="334155"/>
-          <w:sz w:val="21"/>
-        </w:rPr>
         <w:t>La diferencia estaba en un solo lugar: el minuto exacto entre ver el setup y ejecutar la orden. En ese minuto, Andrés seguía un proceso. Y a Carlos... lo agarraba el otro.</w:t>
       </w:r>
     </w:p>
@@ -1679,34 +1405,14 @@
         <w:spacing w:before="60" w:after="80"/>
       </w:pPr>
       <w:r>
-        <w:t>&gt;</w:t>
+        <w:t>El otro. El que entra a recuperar lo perdido. El que dobla la posición porque “esta vez es seguro”. El que no ejecuta el stop porque “ya casi rebota”. Carlos no perdió contra el mercado.</w:t>
       </w:r>
     </w:p>
     <w:p>
       <w:pPr>
-        <w:spacing w:before="80" w:after="80"/>
-        <w:ind w:left="576"/>
+        <w:spacing w:before="60" w:after="80"/>
       </w:pPr>
       <w:r>
-        <w:rPr>
-          <w:i/>
-          <w:color w:val="334155"/>
-          <w:sz w:val="21"/>
-        </w:rPr>
-        <w:t>El otro. El que entra a recuperar lo perdido. El que dobla la posición porque ‘esta vez es seguro’. El que no ejecuta el stop porque ‘ya casi rebota’. Carlos no perdió contra el mercado.</w:t>
-      </w:r>
-    </w:p>
-    <w:p>
-      <w:pPr>
-        <w:spacing w:before="80" w:after="80"/>
-        <w:ind w:left="576"/>
-      </w:pPr>
-      <w:r>
-        <w:rPr>
-          <w:i/>
-          <w:color w:val="334155"/>
-          <w:sz w:val="21"/>
-        </w:rPr>
         <w:t>Perdió contra alguien que vivía en su propia cabeza y operaba gratis.</w:t>
       </w:r>
     </w:p>
@@ -1715,34 +1421,14 @@
         <w:spacing w:before="60" w:after="80"/>
       </w:pPr>
       <w:r>
-        <w:t>&gt;</w:t>
+        <w:t>A ese “otro” lo vamos a llamar por su nombre: el Saboteador.</w:t>
       </w:r>
     </w:p>
     <w:p>
       <w:pPr>
-        <w:spacing w:before="80" w:after="80"/>
-        <w:ind w:left="576"/>
+        <w:spacing w:before="60" w:after="80"/>
       </w:pPr>
       <w:r>
-        <w:rPr>
-          <w:i/>
-          <w:color w:val="334155"/>
-          <w:sz w:val="21"/>
-        </w:rPr>
-        <w:t>A ese ‘otro’ lo vamos a llamar por su nombre: el Saboteador.</w:t>
-      </w:r>
-    </w:p>
-    <w:p>
-      <w:pPr>
-        <w:spacing w:before="80" w:after="80"/>
-        <w:ind w:left="576"/>
-      </w:pPr>
-      <w:r>
-        <w:rPr>
-          <w:i/>
-          <w:color w:val="334155"/>
-          <w:sz w:val="21"/>
-        </w:rPr>
         <w:t>Y la tesis de estos 10 días es una sola frase — anótenla:</w:t>
       </w:r>
     </w:p>
@@ -1750,72 +1436,64 @@
       <w:pPr>
         <w:spacing w:before="60" w:after="80"/>
       </w:pPr>
+      <w:r/>
       <w:r>
-        <w:t>&gt;</w:t>
+        <w:rPr>
+          <w:b/>
+        </w:rPr>
+        <w:t>TU CUENTA NO REFLEJA LO QUE SABES DE MERCADOS.</w:t>
       </w:r>
     </w:p>
     <w:p>
       <w:pPr>
-        <w:spacing w:before="80" w:after="80"/>
-        <w:ind w:left="576"/>
-      </w:pPr>
+        <w:spacing w:before="60" w:after="80"/>
+      </w:pPr>
+      <w:r>
+        <w:t>REFLEJA LO QUE NO SABES DE TI.</w:t>
+      </w:r>
       <w:r>
         <w:rPr>
-          <w:i/>
-          <w:color w:val="334155"/>
-          <w:sz w:val="21"/>
+          <w:b/>
         </w:rPr>
-        <w:t>TU CUENTA NO REFLEJA LO QUE SABES DE MERCADOS. REFLEJA LO QUE NO SABES DE TI.”</w:t>
+        <w:t>”</w:t>
       </w:r>
     </w:p>
     <w:p>
       <w:pPr>
-        <w:spacing w:before="80" w:after="80"/>
-        <w:ind w:left="576"/>
-      </w:pPr>
+        <w:spacing w:before="60" w:after="80"/>
+      </w:pPr>
+      <w:r>
+        <w:t xml:space="preserve">⚡ </w:t>
+      </w:r>
       <w:r>
         <w:rPr>
-          <w:i/>
-          <w:color w:val="334155"/>
-          <w:sz w:val="21"/>
+          <w:b/>
         </w:rPr>
-        <w:t>⚡ CHAT STORM #2 (MINUTO 12:00)</w:t>
+        <w:t>CHAT STORM #2 (MINUTO 12:00)</w:t>
+      </w:r>
+      <w:r/>
+    </w:p>
+    <w:p>
+      <w:pPr>
+        <w:spacing w:before="60" w:after="80"/>
+      </w:pPr>
+      <w:r/>
+      <w:r>
+        <w:rPr>
+          <w:b/>
+        </w:rPr>
+        <w:t>Juan:</w:t>
+      </w:r>
+      <w:r>
+        <w:t xml:space="preserve"> “Sean honestos conmigo que aquí nadie juzga: ¿ustedes son más Carlos o más Andrés? Escriban CARLOS o ANDRÉS en el chat. Una palabra.”</w:t>
       </w:r>
     </w:p>
     <w:p>
       <w:pPr>
-        <w:spacing w:before="80" w:after="80"/>
-        <w:ind w:left="576"/>
+        <w:spacing w:before="60" w:after="80"/>
       </w:pPr>
       <w:r>
-        <w:rPr>
-          <w:i/>
-          <w:color w:val="334155"/>
-          <w:sz w:val="21"/>
-        </w:rPr>
-        <w:t>Juan Villegas: “Sean honestos conmigo que aquí nadie juzga: ¿ustedes son más Carlos o más Andrés? Escriban CARLOS o ANDRÉS en el chat.”</w:t>
-      </w:r>
-    </w:p>
-    <w:p>
-      <w:pPr>
-        <w:spacing w:before="60" w:after="80"/>
-      </w:pPr>
-      <w:r>
-        <w:t>&gt;</w:t>
-      </w:r>
-    </w:p>
-    <w:p>
-      <w:pPr>
-        <w:spacing w:before="80" w:after="80"/>
-        <w:ind w:left="576"/>
-      </w:pPr>
-      <w:r>
-        <w:rPr>
-          <w:i/>
-          <w:color w:val="334155"/>
-          <w:sz w:val="21"/>
-        </w:rPr>
-        <w:t>*Juan lee respuestas por nombre:* “Fernando dice Carlos... María dice Carlos con tres signos de admiración... tranquilos: yo fui Carlos por más años de los que me gusta admitir. Por eso existe este juego.”</w:t>
+        <w:t>Juan lee respuestas por nombre: “Fernando dice Carlos... María dice Carlos con tres signos de admiración... tranquilos: yo fui Carlos por más años de los que me gusta admitir. Por eso existe este juego.”</w:t>
       </w:r>
     </w:p>
     <w:p>
@@ -1828,7 +1506,20 @@
           <w:color w:val="2563EB"/>
           <w:sz w:val="26"/>
         </w:rPr>
-        <w:t>13:00 $\rightarrow$ 19:00 | B4 · LA CIENCIA — Por qué existe tu Saboteador</w:t>
+        <w:t>13:00 → 19:00</w:t>
+      </w:r>
+    </w:p>
+    <w:p>
+      <w:pPr>
+        <w:spacing w:before="240" w:after="80"/>
+      </w:pPr>
+      <w:r>
+        <w:rPr>
+          <w:b/>
+          <w:color w:val="2563EB"/>
+          <w:sz w:val="26"/>
+        </w:rPr>
+        <w:t>B4 · LA CIENCIA — por qué existe tu Saboteador</w:t>
       </w:r>
     </w:p>
     <w:p>
@@ -1843,48 +1534,22 @@
         <w:t>EN PANTALLA:</w:t>
       </w:r>
       <w:r>
-        <w:t xml:space="preserve"> Slide: *"TU CEREBRO NO FUE DISEÑADO PARA ESTO"* — luego 3 mecanismos, uno a uno.</w:t>
+        <w:t xml:space="preserve"> Slide: *"TU CEREBRO NO FUE DISEÑADO PARA ESTO"* — luego 3 mecanismos, uno a uno</w:t>
       </w:r>
     </w:p>
     <w:p>
       <w:pPr>
-        <w:spacing w:before="80" w:after="80"/>
-        <w:ind w:left="576"/>
+        <w:spacing w:before="60" w:after="80"/>
       </w:pPr>
       <w:r>
-        <w:rPr>
-          <w:i/>
-          <w:color w:val="334155"/>
-          <w:sz w:val="21"/>
-        </w:rPr>
-        <w:t>Juan Villegas:</w:t>
+        <w:t>“Ahora la parte que ningún vendedor de indicadores te cuenta.</w:t>
       </w:r>
     </w:p>
     <w:p>
       <w:pPr>
-        <w:spacing w:before="80" w:after="80"/>
-        <w:ind w:left="576"/>
+        <w:spacing w:before="60" w:after="80"/>
       </w:pPr>
       <w:r>
-        <w:rPr>
-          <w:i/>
-          <w:color w:val="334155"/>
-          <w:sz w:val="21"/>
-        </w:rPr>
-        <w:t>“Ahora la parte que ningún vendedor de cursos te cuenta.</w:t>
-      </w:r>
-    </w:p>
-    <w:p>
-      <w:pPr>
-        <w:spacing w:before="80" w:after="80"/>
-        <w:ind w:left="576"/>
-      </w:pPr>
-      <w:r>
-        <w:rPr>
-          <w:i/>
-          <w:color w:val="334155"/>
-          <w:sz w:val="21"/>
-        </w:rPr>
         <w:t>El Saboteador no es un defecto tuyo. Es tu cerebro funcionando EXACTAMENTE como fue diseñado — pero para otro mundo.</w:t>
       </w:r>
     </w:p>
@@ -1893,21 +1558,15 @@
         <w:spacing w:before="60" w:after="80"/>
       </w:pPr>
       <w:r>
-        <w:t>&gt;</w:t>
+        <w:t>Mecanismo uno: la aversión a la pérdida. Hay décadas de investigación en economía del comportamiento detrás de esto — le dieron un Nobel a Kahneman en parte por demostrarlo: perder duele aproximadamente el doble de lo que ganar alegra. El mismo monto. El doble de dolor.</w:t>
       </w:r>
     </w:p>
     <w:p>
       <w:pPr>
-        <w:spacing w:before="80" w:after="80"/>
-        <w:ind w:left="576"/>
+        <w:spacing w:before="60" w:after="80"/>
       </w:pPr>
       <w:r>
-        <w:rPr>
-          <w:i/>
-          <w:color w:val="334155"/>
-          <w:sz w:val="21"/>
-        </w:rPr>
-        <w:t>Mecanismo uno: la aversión a la pérdida. Hay décadas de investigación en economía del comportamiento detrás de esto — le dieron un Nobel a Daniel Kahneman en parte por demostrarlo: perder duele aproximadamente el DOBLE de lo que ganar alegra. El mismo monto. El doble de dolor.</w:t>
+        <w:t>¿Qué hace un cerebro que siente el doble de dolor por una pérdida? Lo que sea necesario para no sentirla. Mover el stop. Promediar a la baja. “Esperar a que rebote”. No es indisciplina — es anestesia.</w:t>
       </w:r>
     </w:p>
     <w:p>
@@ -1915,21 +1574,15 @@
         <w:spacing w:before="60" w:after="80"/>
       </w:pPr>
       <w:r>
-        <w:t>&gt;</w:t>
+        <w:t>Mecanismo dos: la dopamina. El cerebro no libera dopamina cuando GANAS — la libera cuando ANTICIPAR ganar. Es el mismo circuito de la máquina tragamonedas: recompensa variable e impredecible. Por eso hay gente que “opera por operar”: no busca dinero, busca la descarga de apretar el botón. El mercado es el casino perfecto — abierto 24 horas y disfrazado de trabajo serio.</w:t>
       </w:r>
     </w:p>
     <w:p>
       <w:pPr>
-        <w:spacing w:before="80" w:after="80"/>
-        <w:ind w:left="576"/>
+        <w:spacing w:before="60" w:after="80"/>
       </w:pPr>
       <w:r>
-        <w:rPr>
-          <w:i/>
-          <w:color w:val="334155"/>
-          <w:sz w:val="21"/>
-        </w:rPr>
-        <w:t>¿Qué hace un cerebro que siente el doble de dolor por una pérdida? Lo que sea necesario para no sentirla. Mover el stop. Promediar a la baja. ‘Esperar a que rebote’. No es indisciplina — es anestesia.</w:t>
+        <w:t>Mecanismo tres: el secuestro emocional. Cuando tu cuenta está en rojo vivo, la parte emocional de tu cerebro toma el control y la parte que planifica — la que estudió análisis técnico durante meses — literalmente pierde el mando. Todo lo que aprendiste queda encerrado fuera de la sala donde se toma la decisión.</w:t>
       </w:r>
     </w:p>
     <w:p>
@@ -1937,64 +1590,6 @@
         <w:spacing w:before="60" w:after="80"/>
       </w:pPr>
       <w:r>
-        <w:t>&gt;</w:t>
-      </w:r>
-    </w:p>
-    <w:p>
-      <w:pPr>
-        <w:spacing w:before="80" w:after="80"/>
-        <w:ind w:left="576"/>
-      </w:pPr>
-      <w:r>
-        <w:rPr>
-          <w:i/>
-          <w:color w:val="334155"/>
-          <w:sz w:val="21"/>
-        </w:rPr>
-        <w:t>Mecanismo dos: la dopamina. El cerebro no libera dopamina cuando GANAS — la libera cuando ANTICIPAS ganar. Es el mismo circuito de las tragamonedas: recompensa variable e impredecible. Por eso hay gente que ‘opera por operar’: no busca dinero, busca la descarga de apretar el botón.</w:t>
-      </w:r>
-    </w:p>
-    <w:p>
-      <w:pPr>
-        <w:spacing w:before="60" w:after="80"/>
-      </w:pPr>
-      <w:r>
-        <w:t>&gt;</w:t>
-      </w:r>
-    </w:p>
-    <w:p>
-      <w:pPr>
-        <w:spacing w:before="80" w:after="80"/>
-        <w:ind w:left="576"/>
-      </w:pPr>
-      <w:r>
-        <w:rPr>
-          <w:i/>
-          <w:color w:val="334155"/>
-          <w:sz w:val="21"/>
-        </w:rPr>
-        <w:t>Mecanismo tres: el secuestro emocional. Cuando tu cuenta está en rojo vivo, la parte emocional toma el control y la parte que planifica — la que estudió análisis técnico durante meses — literalmente pierde el mando.</w:t>
-      </w:r>
-    </w:p>
-    <w:p>
-      <w:pPr>
-        <w:spacing w:before="60" w:after="80"/>
-      </w:pPr>
-      <w:r>
-        <w:t>&gt;</w:t>
-      </w:r>
-    </w:p>
-    <w:p>
-      <w:pPr>
-        <w:spacing w:before="80" w:after="80"/>
-        <w:ind w:left="576"/>
-      </w:pPr>
-      <w:r>
-        <w:rPr>
-          <w:i/>
-          <w:color w:val="334155"/>
-          <w:sz w:val="21"/>
-        </w:rPr>
         <w:t>Por eso estudiar más no te estaba funcionando: estabas entrenando a un piloto al que le quitan el mando justo cuando empieza la turbulencia.”</w:t>
       </w:r>
     </w:p>
@@ -2008,7 +1603,20 @@
           <w:color w:val="2563EB"/>
           <w:sz w:val="26"/>
         </w:rPr>
-        <w:t>19:00 $\rightarrow$ 28:00 | B5 · LOS 4 ARQUETIPOS — El corazón del live</w:t>
+        <w:t>19:00 → 28:00</w:t>
+      </w:r>
+    </w:p>
+    <w:p>
+      <w:pPr>
+        <w:spacing w:before="240" w:after="80"/>
+      </w:pPr>
+      <w:r>
+        <w:rPr>
+          <w:b/>
+          <w:color w:val="2563EB"/>
+          <w:sz w:val="26"/>
+        </w:rPr>
+        <w:t>B5 · LOS 4 ARQUETIPOS — el corazón del live</w:t>
       </w:r>
     </w:p>
     <w:p>
@@ -2029,287 +1637,167 @@
         <w:rPr>
           <w:b/>
         </w:rPr>
-        <w:t>EL VENGADOR</w:t>
+        <w:t>EL VENGADOR / EL EUFÓRICO / EL IMPACIENTE / EL PARALIZADO</w:t>
+      </w:r>
+      <w:r/>
+    </w:p>
+    <w:p>
+      <w:pPr>
+        <w:spacing w:before="60" w:after="80"/>
+      </w:pPr>
+      <w:r>
+        <w:t>“Después de miles de bitácoras de estudiantes, los patrones se repiten tanto que les pusimos nombre. Cuatro saboteadores. Prestenles respeto, que llevan años cobrando sin nómina.</w:t>
+      </w:r>
+    </w:p>
+    <w:p>
+      <w:pPr>
+        <w:spacing w:before="60" w:after="80"/>
+      </w:pPr>
+      <w:r/>
+      <w:r>
+        <w:rPr>
+          <w:b/>
+        </w:rPr>
+        <w:t>EL VENGADOR.</w:t>
       </w:r>
       <w:r>
-        <w:t xml:space="preserve"> / </w:t>
+        <w:t xml:space="preserve"> Aparece después de una pérdida. Su frase: “el mercado me debe esta”. Dobla el tamaño, ignora el plan, opera el mismo activo que lo golpeó — porque esto ya es personal. Es la aversión a la pérdida en su forma más pura: prefiere arriesgar el mes entero antes que cerrar el día en rojo. Firma característica: una pérdida pequeña convertida en la pérdida del mes en menos de dos horas.</w:t>
+      </w:r>
+    </w:p>
+    <w:p>
+      <w:pPr>
+        <w:spacing w:before="60" w:after="80"/>
+      </w:pPr>
+      <w:r/>
+      <w:r>
+        <w:rPr>
+          <w:b/>
+        </w:rPr>
+        <w:t>EL EUFÓRICO.</w:t>
+      </w:r>
+      <w:r>
+        <w:t xml:space="preserve"> Aparece después de tres ganadoras seguidas. Su frase: “ya le agarré el truco a esto”. Sube el tamaño, abandona la gestión de riesgo — total, “está regalado”. Es la dopamina hablando: la racha se siente como habilidad. Firma característica: devuelve en dos días lo que construyó en tres semanas. Levanten la mano los que devolvieron una cuenta entera después de su mejor mes... exacto. Ese.</w:t>
+      </w:r>
+    </w:p>
+    <w:p>
+      <w:pPr>
+        <w:spacing w:before="60" w:after="80"/>
+      </w:pPr>
+      <w:r/>
+      <w:r>
+        <w:rPr>
+          <w:b/>
+        </w:rPr>
+        <w:t>EL IMPACIENTE.</w:t>
+      </w:r>
+      <w:r>
+        <w:t xml:space="preserve"> No soporta estar fuera del mercado. Su frase: “se me está yendo el movimiento”. Entra sin señal, persigue velas, opera en 5 mercados a la vez. Es el circuito de anticipación buscando su descarga: el botón ES la recompensa. Firma característica: veinte trades mediocres que se comen las comisiones y los tres trades buenos.</w:t>
+      </w:r>
+    </w:p>
+    <w:p>
+      <w:pPr>
+        <w:spacing w:before="60" w:after="80"/>
+      </w:pPr>
+      <w:r/>
+      <w:r>
+        <w:rPr>
+          <w:b/>
+        </w:rPr>
+        <w:t>EL PARALIZADO.</w:t>
+      </w:r>
+      <w:r>
+        <w:t xml:space="preserve"> El más silencioso y el más caro. Ve el setup perfecto — el que estudió durante meses — y no ejecuta. Su frase: “mejor espero confirmación”. Y cuando entra, cierra las ganadoras al primer respiro porque el miedo a devolver duele más que la ambición. Firma característica: gana poquito cuando acierta, pierde completo cuando falla. Matemática invertida. Cuenta que sangra lento.”</w:t>
+      </w:r>
+    </w:p>
+    <w:p>
+      <w:pPr>
+        <w:spacing w:before="60" w:after="80"/>
+      </w:pPr>
+      <w:r>
+        <w:t xml:space="preserve">⚡ </w:t>
       </w:r>
       <w:r>
         <w:rPr>
           <w:b/>
         </w:rPr>
-        <w:t>EL EUFÓRICO</w:t>
+        <w:t>ENCUESTA 2 (YOUTUBE LIVE — MINUTO 24:00)</w:t>
       </w:r>
+      <w:r/>
+    </w:p>
+    <w:p>
+      <w:pPr>
+        <w:spacing w:before="60" w:after="80"/>
+      </w:pPr>
+      <w:r/>
       <w:r>
-        <w:t xml:space="preserve"> / </w:t>
+        <w:rPr>
+          <w:b/>
+        </w:rPr>
+        <w:t>“Momento de la verdad. ¿Cuál de los 4 operó tu cuenta la última vez que rompiste tu plan?”</w:t>
+      </w:r>
+      <w:r/>
+    </w:p>
+    <w:p>
+      <w:pPr>
+        <w:spacing w:before="60" w:after="80"/>
+      </w:pPr>
+      <w:r>
+        <w:t>A) EL VENGADOR — entré a recuperar</w:t>
+      </w:r>
+    </w:p>
+    <w:p>
+      <w:pPr>
+        <w:spacing w:before="60" w:after="80"/>
+      </w:pPr>
+      <w:r>
+        <w:t>B) EL EUFÓRICO — me sentí invencible</w:t>
+      </w:r>
+    </w:p>
+    <w:p>
+      <w:pPr>
+        <w:spacing w:before="60" w:after="80"/>
+      </w:pPr>
+      <w:r>
+        <w:t>C) EL IMPACIENTE — no aguanté estar fuera</w:t>
+      </w:r>
+    </w:p>
+    <w:p>
+      <w:pPr>
+        <w:spacing w:before="60" w:after="80"/>
+      </w:pPr>
+      <w:r>
+        <w:t>D) EL PARALIZADO — no ejecuté / cerré temprano</w:t>
+      </w:r>
+    </w:p>
+    <w:p>
+      <w:pPr>
+        <w:spacing w:before="60" w:after="80"/>
+      </w:pPr>
+      <w:r>
+        <w:t>Juan revela su apuesta del minuto 5 y comenta el resultado real: “¡Aposté por el Vengador y ganó el Impaciente! Esta comunidad no aguanta estar quieta...” — el dato se convierte en contenido del live y del reel de mañana.</w:t>
+      </w:r>
+    </w:p>
+    <w:p>
+      <w:pPr>
+        <w:spacing w:before="60" w:after="80"/>
+      </w:pPr>
+      <w:r>
+        <w:t xml:space="preserve">⚡ </w:t>
       </w:r>
       <w:r>
         <w:rPr>
           <w:b/>
         </w:rPr>
-        <w:t>EL IMPACIENTE</w:t>
+        <w:t>CHAT STORM #3 (MINUTO 27:00)</w:t>
       </w:r>
-      <w:r>
-        <w:t xml:space="preserve"> / </w:t>
-      </w:r>
-      <w:r>
-        <w:rPr>
-          <w:b/>
-        </w:rPr>
-        <w:t>EL PARALIZADO</w:t>
-      </w:r>
-      <w:r>
-        <w:t>.</w:t>
-      </w:r>
+      <w:r/>
     </w:p>
     <w:p>
       <w:pPr>
-        <w:spacing w:before="80" w:after="80"/>
-        <w:ind w:left="576"/>
+        <w:spacing w:before="60" w:after="80"/>
       </w:pPr>
       <w:r>
-        <w:rPr>
-          <w:i/>
-          <w:color w:val="334155"/>
-          <w:sz w:val="21"/>
-        </w:rPr>
-        <w:t>Juan Villegas:</w:t>
-      </w:r>
-    </w:p>
-    <w:p>
-      <w:pPr>
-        <w:spacing w:before="80" w:after="80"/>
-        <w:ind w:left="576"/>
-      </w:pPr>
-      <w:r>
-        <w:rPr>
-          <w:i/>
-          <w:color w:val="334155"/>
-          <w:sz w:val="21"/>
-        </w:rPr>
-        <w:t>“Después de miles de bitácoras de estudiantes, los patrones se repiten tanto que les pusimos nombre. Cuatro saboteadores. Préstenles respeto, que llevan años cobrando sin nómina.</w:t>
-      </w:r>
-    </w:p>
-    <w:p>
-      <w:pPr>
-        <w:spacing w:before="60" w:after="80"/>
-      </w:pPr>
-      <w:r>
-        <w:t>&gt;</w:t>
-      </w:r>
-    </w:p>
-    <w:p>
-      <w:pPr>
-        <w:spacing w:before="80" w:after="80"/>
-        <w:ind w:left="576"/>
-      </w:pPr>
-      <w:r>
-        <w:rPr>
-          <w:i/>
-          <w:color w:val="334155"/>
-          <w:sz w:val="21"/>
-        </w:rPr>
-        <w:t>1. EL VENGADOR. Aparece después de una pérdida. Su frase: *‘el mercado me debe esta’*. Dobla el tamaño, ignora el plan, opera el mismo activo que lo golpeó. Firma característica: una pérdida pequeña convertida en la pérdida del mes en menos de dos horas.</w:t>
-      </w:r>
-    </w:p>
-    <w:p>
-      <w:pPr>
-        <w:spacing w:before="60" w:after="80"/>
-      </w:pPr>
-      <w:r>
-        <w:t>&gt;</w:t>
-      </w:r>
-    </w:p>
-    <w:p>
-      <w:pPr>
-        <w:spacing w:before="80" w:after="80"/>
-        <w:ind w:left="576"/>
-      </w:pPr>
-      <w:r>
-        <w:rPr>
-          <w:i/>
-          <w:color w:val="334155"/>
-          <w:sz w:val="21"/>
-        </w:rPr>
-        <w:t>2. EL EUFÓRICO. Aparece después de tres ganadoras seguidas. Su frase: *‘ya le agarré el truco a esto’*. Sube el tamaño, abandona la gestión de riesgo. Firma característica: devuelve en dos días lo que construyó en tres semanas.</w:t>
-      </w:r>
-    </w:p>
-    <w:p>
-      <w:pPr>
-        <w:spacing w:before="60" w:after="80"/>
-      </w:pPr>
-      <w:r>
-        <w:t>&gt;</w:t>
-      </w:r>
-    </w:p>
-    <w:p>
-      <w:pPr>
-        <w:spacing w:before="80" w:after="80"/>
-        <w:ind w:left="576"/>
-      </w:pPr>
-      <w:r>
-        <w:rPr>
-          <w:i/>
-          <w:color w:val="334155"/>
-          <w:sz w:val="21"/>
-        </w:rPr>
-        <w:t>3. EL IMPACIENTE. No soporta estar fuera del mercado. Su frase: *‘se me está yendo el movimiento’*. Entra sin señal, persigue velas, opera en 5 mercados a la vez. Firma característica: veinte trades mediocres que se comen las comisiones.</w:t>
-      </w:r>
-    </w:p>
-    <w:p>
-      <w:pPr>
-        <w:spacing w:before="60" w:after="80"/>
-      </w:pPr>
-      <w:r>
-        <w:t>&gt;</w:t>
-      </w:r>
-    </w:p>
-    <w:p>
-      <w:pPr>
-        <w:spacing w:before="80" w:after="80"/>
-        <w:ind w:left="576"/>
-      </w:pPr>
-      <w:r>
-        <w:rPr>
-          <w:i/>
-          <w:color w:val="334155"/>
-          <w:sz w:val="21"/>
-        </w:rPr>
-        <w:t>4. EL PARALIZADO. El más silencioso y el más caro. Ve el setup perfecto y no ejecuta. Su frase: *‘mejor espero confirmación’*. Y cuando entra, cierra las ganadoras al primer respiro por miedo. Firma característica: gana poquito cuando acierta, pierde completo cuando falla.”</w:t>
-      </w:r>
-    </w:p>
-    <w:p>
-      <w:pPr>
-        <w:spacing w:before="80" w:after="80"/>
-        <w:ind w:left="576"/>
-      </w:pPr>
-      <w:r>
-        <w:rPr>
-          <w:i/>
-          <w:color w:val="334155"/>
-          <w:sz w:val="21"/>
-        </w:rPr>
-        <w:t>⚡ ENCUESTA 2 (YOUTUBE LIVE — MINUTO 24:00)</w:t>
-      </w:r>
-    </w:p>
-    <w:p>
-      <w:pPr>
-        <w:spacing w:before="80" w:after="80"/>
-        <w:ind w:left="576"/>
-      </w:pPr>
-      <w:r>
-        <w:rPr>
-          <w:i/>
-          <w:color w:val="334155"/>
-          <w:sz w:val="21"/>
-        </w:rPr>
-        <w:t>“Momento de la verdad: ¿Cuál de los 4 operó tu cuenta la última vez que rompiste tu plan?”</w:t>
-      </w:r>
-    </w:p>
-    <w:p>
-      <w:pPr>
-        <w:spacing w:before="80" w:after="80"/>
-        <w:ind w:left="576"/>
-      </w:pPr>
-      <w:r>
-        <w:rPr>
-          <w:i/>
-          <w:color w:val="334155"/>
-          <w:sz w:val="21"/>
-        </w:rPr>
-        <w:t>- A) EL VENGADOR — entré a recuperar</w:t>
-      </w:r>
-    </w:p>
-    <w:p>
-      <w:pPr>
-        <w:spacing w:before="80" w:after="80"/>
-        <w:ind w:left="576"/>
-      </w:pPr>
-      <w:r>
-        <w:rPr>
-          <w:i/>
-          <w:color w:val="334155"/>
-          <w:sz w:val="21"/>
-        </w:rPr>
-        <w:t>- B) EL EUFÓRICO — me sentí invencible</w:t>
-      </w:r>
-    </w:p>
-    <w:p>
-      <w:pPr>
-        <w:spacing w:before="80" w:after="80"/>
-        <w:ind w:left="576"/>
-      </w:pPr>
-      <w:r>
-        <w:rPr>
-          <w:i/>
-          <w:color w:val="334155"/>
-          <w:sz w:val="21"/>
-        </w:rPr>
-        <w:t>- C) EL IMPACIENTE — no aguanté estar fuera</w:t>
-      </w:r>
-    </w:p>
-    <w:p>
-      <w:pPr>
-        <w:spacing w:before="80" w:after="80"/>
-        <w:ind w:left="576"/>
-      </w:pPr>
-      <w:r>
-        <w:rPr>
-          <w:i/>
-          <w:color w:val="334155"/>
-          <w:sz w:val="21"/>
-        </w:rPr>
-        <w:t>- D) EL PARALIZADO — no ejecuté / cerré temprano</w:t>
-      </w:r>
-    </w:p>
-    <w:p>
-      <w:pPr>
-        <w:spacing w:before="60" w:after="80"/>
-      </w:pPr>
-      <w:r>
-        <w:t>*Juan revela su apuesta del inicio:*</w:t>
-      </w:r>
-    </w:p>
-    <w:p>
-      <w:pPr>
-        <w:spacing w:before="80" w:after="80"/>
-        <w:ind w:left="576"/>
-      </w:pPr>
-      <w:r>
-        <w:rPr>
-          <w:i/>
-          <w:color w:val="334155"/>
-          <w:sz w:val="21"/>
-        </w:rPr>
-        <w:t>“¡Aposté por el Vengador y miren el chat: va ganando el Impaciente! Esta comunidad no aguanta estar quieta...”</w:t>
-      </w:r>
-    </w:p>
-    <w:p>
-      <w:pPr>
-        <w:spacing w:before="80" w:after="80"/>
-        <w:ind w:left="576"/>
-      </w:pPr>
-      <w:r>
-        <w:rPr>
-          <w:i/>
-          <w:color w:val="334155"/>
-          <w:sz w:val="21"/>
-        </w:rPr>
-        <w:t>⚡ CHAT STORM #3 (MINUTO 27:00)</w:t>
-      </w:r>
-    </w:p>
-    <w:p>
-      <w:pPr>
-        <w:spacing w:before="80" w:after="80"/>
-        <w:ind w:left="576"/>
-      </w:pPr>
-      <w:r>
-        <w:rPr>
-          <w:i/>
-          <w:color w:val="334155"/>
-          <w:sz w:val="21"/>
-        </w:rPr>
-        <w:t>Juan Villegas: “Escriban en el chat la frase EXACTA que su saboteador les dice antes de cometer el error. La más brutal la leo al aire.” *(El CM guarda las mejores frases para anuncios y contenido).*</w:t>
+        <w:t>“Escriban en el chat la frase EXACTA que su saboteador les dice. La más brutal la leo al aire.” (Este chat es una mina de copy para los ads — el CM guarda las mejores.)</w:t>
       </w:r>
     </w:p>
     <w:p>
@@ -2322,7 +1810,20 @@
           <w:color w:val="2563EB"/>
           <w:sz w:val="26"/>
         </w:rPr>
-        <w:t>28:00 $\rightarrow$ 33:00 | B6 · CÓMO SE LE GANA — La puerta a PEDEM</w:t>
+        <w:t>28:00 → 33:00</w:t>
+      </w:r>
+    </w:p>
+    <w:p>
+      <w:pPr>
+        <w:spacing w:before="240" w:after="80"/>
+      </w:pPr>
+      <w:r>
+        <w:rPr>
+          <w:b/>
+          <w:color w:val="2563EB"/>
+          <w:sz w:val="26"/>
+        </w:rPr>
+        <w:t>B6 · CÓMO SE LE GANA — la puerta a PEDEM</w:t>
       </w:r>
     </w:p>
     <w:p>
@@ -2337,34 +1838,14 @@
         <w:t>EN PANTALLA:</w:t>
       </w:r>
       <w:r>
-        <w:t xml:space="preserve"> Slide: *"LA FUERZA DE VOLUNTAD NO ES UN PLAN"* $\rightarrow$ luego: cabina de avión.</w:t>
+        <w:t xml:space="preserve"> Slide: *"LA FUERZA DE VOLUNTAD NO ES UN PLAN"* → luego: cabina de avión</w:t>
       </w:r>
     </w:p>
     <w:p>
       <w:pPr>
-        <w:spacing w:before="80" w:after="80"/>
-        <w:ind w:left="576"/>
+        <w:spacing w:before="60" w:after="80"/>
       </w:pPr>
       <w:r>
-        <w:rPr>
-          <w:i/>
-          <w:color w:val="334155"/>
-          <w:sz w:val="21"/>
-        </w:rPr>
-        <w:t>Juan Villegas:</w:t>
-      </w:r>
-    </w:p>
-    <w:p>
-      <w:pPr>
-        <w:spacing w:before="80" w:after="80"/>
-        <w:ind w:left="576"/>
-      </w:pPr>
-      <w:r>
-        <w:rPr>
-          <w:i/>
-          <w:color w:val="334155"/>
-          <w:sz w:val="21"/>
-        </w:rPr>
         <w:t>“Ahora la pregunta que importa: ¿cómo se le gana a alguien que vive en tu cabeza y conoce todas tus contraseñas?</w:t>
       </w:r>
     </w:p>
@@ -2373,21 +1854,15 @@
         <w:spacing w:before="60" w:after="80"/>
       </w:pPr>
       <w:r>
-        <w:t>&gt;</w:t>
+        <w:t>Te digo primero cómo NO se le gana: con fuerza de voluntad.</w:t>
       </w:r>
     </w:p>
     <w:p>
       <w:pPr>
-        <w:spacing w:before="80" w:after="80"/>
-        <w:ind w:left="576"/>
+        <w:spacing w:before="60" w:after="80"/>
       </w:pPr>
       <w:r>
-        <w:rPr>
-          <w:i/>
-          <w:color w:val="334155"/>
-          <w:sz w:val="21"/>
-        </w:rPr>
-        <w:t>Te digo primero cómo NO se le gana: con fuerza de voluntad. ‘Mañana sí voy a respetar el stop.’ ¿Cuántas veces lo has dicho? La fuerza de voluntad es un recurso que se agota exactamente cuando más lo necesitas.</w:t>
+        <w:t>“Mañana sí voy a respetar el stop.” ¿Cuántas veces lo has dicho?</w:t>
       </w:r>
     </w:p>
     <w:p>
@@ -2395,21 +1870,15 @@
         <w:spacing w:before="60" w:after="80"/>
       </w:pPr>
       <w:r>
-        <w:t>&gt;</w:t>
+        <w:t>La fuerza de voluntad es un recurso que se agota exactamente cuando más lo necesitas: al final de una mala racha, cansado, en rojo.</w:t>
       </w:r>
     </w:p>
     <w:p>
       <w:pPr>
-        <w:spacing w:before="80" w:after="80"/>
-        <w:ind w:left="576"/>
+        <w:spacing w:before="60" w:after="80"/>
       </w:pPr>
       <w:r>
-        <w:rPr>
-          <w:i/>
-          <w:color w:val="334155"/>
-          <w:sz w:val="21"/>
-        </w:rPr>
-        <w:t>Ahora piensa en un piloto de avión. Veinte mil horas de vuelo. ¿Sabes qué hace antes de despegar? Saca una lista de chequeo y la lee en voz alta. Punto por punto. ¿Por qué? Porque la aviación entendió hace décadas lo que el trading amateur no ha entendido: en ambientes de presión, el ser humano falla por estado emocional.</w:t>
+        <w:t>Confiar tu dinero a tu estado de ánimo es el plan del Saboteador.</w:t>
       </w:r>
     </w:p>
     <w:p>
@@ -2417,49 +1886,94 @@
         <w:spacing w:before="60" w:after="80"/>
       </w:pPr>
       <w:r>
-        <w:t>&gt;</w:t>
+        <w:t>Ahora piensa en un piloto de avión. Veinte mil horas de vuelo.</w:t>
       </w:r>
     </w:p>
     <w:p>
       <w:pPr>
-        <w:spacing w:before="80" w:after="80"/>
-        <w:ind w:left="576"/>
+        <w:spacing w:before="60" w:after="80"/>
       </w:pPr>
       <w:r>
-        <w:rPr>
-          <w:i/>
-          <w:color w:val="334155"/>
-          <w:sz w:val="21"/>
-        </w:rPr>
-        <w:t>Eso es un sistema: una estructura EXTERNA a tu estado de ánimo.</w:t>
+        <w:t>¿Sabes qué hace antes de despegar? Saca una lista de chequeo y la lee. En voz alta. Punto por punto. ¿Por qué, si se la sabe de memoria? Porque la aviación entendió hace décadas lo que el trading amateur no ha entendido: en ambientes de presión, el ser humano no falla por ignorancia — falla por estado emocional.</w:t>
       </w:r>
     </w:p>
     <w:p>
       <w:pPr>
-        <w:spacing w:before="80" w:after="80"/>
-        <w:ind w:left="576"/>
+        <w:spacing w:before="60" w:after="80"/>
       </w:pPr>
       <w:r>
-        <w:rPr>
-          <w:i/>
-          <w:color w:val="334155"/>
-          <w:sz w:val="21"/>
-        </w:rPr>
-        <w:t>El nuestro se llama PEDEM: Planear, Ejecutar, Documentar, Evaluar, Mejorar.</w:t>
+        <w:t>La lista no está ahí para informar al piloto. Está ahí para protegerlo de sí mismo.</w:t>
       </w:r>
     </w:p>
     <w:p>
       <w:pPr>
-        <w:spacing w:before="80" w:after="80"/>
-        <w:ind w:left="576"/>
-      </w:pPr>
+        <w:spacing w:before="60" w:after="80"/>
+      </w:pPr>
+      <w:r>
+        <w:t>Eso es un sistema: una estructura EXTERNA a tu estado de ánimo que decide por adelantado lo que tu mejor versión ya decidió.</w:t>
+      </w:r>
+    </w:p>
+    <w:p>
+      <w:pPr>
+        <w:spacing w:before="60" w:after="80"/>
+      </w:pPr>
+      <w:r>
+        <w:t xml:space="preserve">El nuestro se llama </w:t>
+      </w:r>
       <w:r>
         <w:rPr>
-          <w:i/>
-          <w:color w:val="334155"/>
-          <w:sz w:val="21"/>
+          <w:b/>
         </w:rPr>
-        <w:t>No elimina al Saboteador — le quita el teclado. Y en los próximos días lo vamos a entrenar paso a paso sobre mi cuenta real.”</w:t>
+        <w:t>PEDEM: Planear, Ejecutar, Documentar, Evaluar, Mejorar</w:t>
+      </w:r>
+      <w:r>
+        <w:t>. Cinco letras que funcionan como la cabina del piloto.</w:t>
+      </w:r>
+    </w:p>
+    <w:p>
+      <w:pPr>
+        <w:spacing w:before="60" w:after="80"/>
+      </w:pPr>
+      <w:r>
+        <w:t>No eliminan al Saboteador — eso no se puede. Le quitan el teclado.</w:t>
+      </w:r>
+    </w:p>
+    <w:p>
+      <w:pPr>
+        <w:spacing w:before="60" w:after="80"/>
+      </w:pPr>
+      <w:r>
+        <w:t>Y los próximos cinco días vamos a entrenar las cinco letras, una por una, sobre mi cuenta real. No teoría: proceso ejecutándose con dinero de verdad delante de ustedes.”</w:t>
+      </w:r>
+    </w:p>
+    <w:p>
+      <w:pPr>
+        <w:spacing w:before="60" w:after="80"/>
+      </w:pPr>
+      <w:r>
+        <w:t xml:space="preserve">⚡ </w:t>
+      </w:r>
+      <w:r>
+        <w:rPr>
+          <w:b/>
+        </w:rPr>
+        <w:t>CHAT DE COMPROMISO (MINUTO 32:00)</w:t>
+      </w:r>
+      <w:r/>
+    </w:p>
+    <w:p>
+      <w:pPr>
+        <w:spacing w:before="60" w:after="80"/>
+      </w:pPr>
+      <w:r/>
+      <w:r>
+        <w:rPr>
+          <w:b/>
+        </w:rPr>
+        <w:t>Juan:</w:t>
+      </w:r>
+      <w:r>
+        <w:t xml:space="preserve"> “Escriban SISTEMA en el chat si entendieron por qué su problema nunca fue el análisis. Quiero ver el chat lleno antes de mostrarles cómo se gana este juego.”</w:t>
       </w:r>
     </w:p>
     <w:p>
@@ -2472,7 +1986,20 @@
           <w:color w:val="2563EB"/>
           <w:sz w:val="26"/>
         </w:rPr>
-        <w:t>33:00 $\rightarrow$ 38:00 | B7 · EL JUEGO — Gamificación y Reglas</w:t>
+        <w:t>33:00 → 38:00</w:t>
+      </w:r>
+    </w:p>
+    <w:p>
+      <w:pPr>
+        <w:spacing w:before="240" w:after="80"/>
+      </w:pPr>
+      <w:r>
+        <w:rPr>
+          <w:b/>
+          <w:color w:val="2563EB"/>
+          <w:sz w:val="26"/>
+        </w:rPr>
+        <w:t>B7 · EL JUEGO — gamificación + QUIZ EN CHAT</w:t>
       </w:r>
     </w:p>
     <w:p>
@@ -2487,35 +2014,23 @@
         <w:t>EN PANTALLA:</w:t>
       </w:r>
       <w:r>
-        <w:t xml:space="preserve"> Slides del sistema: Puntos de Control $\rightarrow$ 5 Rangos Mentales $\rightarrow$ Becas y Licencias de Algoritmos.</w:t>
+        <w:t xml:space="preserve"> Slides del sistema: Puntos de Control → 5 estados mentales → premios (beca $1,497 al #1) → Círculos → hitos colectivos</w:t>
       </w:r>
     </w:p>
     <w:p>
       <w:pPr>
-        <w:spacing w:before="80" w:after="80"/>
-        <w:ind w:left="576"/>
+        <w:spacing w:before="60" w:after="80"/>
       </w:pPr>
       <w:r>
-        <w:rPr>
-          <w:i/>
-          <w:color w:val="334155"/>
-          <w:sz w:val="21"/>
-        </w:rPr>
-        <w:t>Juan Villegas:</w:t>
+        <w:t>“Les dije que esto no era un curso. Ahora lo pruebo.</w:t>
       </w:r>
     </w:p>
     <w:p>
       <w:pPr>
-        <w:spacing w:before="80" w:after="80"/>
-        <w:ind w:left="576"/>
+        <w:spacing w:before="60" w:after="80"/>
       </w:pPr>
       <w:r>
-        <w:rPr>
-          <w:i/>
-          <w:color w:val="334155"/>
-          <w:sz w:val="21"/>
-        </w:rPr>
-        <w:t>“Les dije que esto no era un curso. Durante 10 días todo lo que hagan paga Puntos de Control: llegar al live paga, entrenar paga, completar misiones en la app paga.</w:t>
+        <w:t>Durante 10 días todo lo que hagan paga Puntos de Control:</w:t>
       </w:r>
     </w:p>
     <w:p>
@@ -2523,21 +2038,15 @@
         <w:spacing w:before="60" w:after="80"/>
       </w:pPr>
       <w:r>
-        <w:t>&gt;</w:t>
+        <w:t>llegar al live paga. Llegar temprano paga más. Entrenar paga.</w:t>
       </w:r>
     </w:p>
     <w:p>
       <w:pPr>
-        <w:spacing w:before="80" w:after="80"/>
-        <w:ind w:left="576"/>
+        <w:spacing w:before="60" w:after="80"/>
       </w:pPr>
       <w:r>
-        <w:rPr>
-          <w:i/>
-          <w:color w:val="334155"/>
-          <w:sz w:val="21"/>
-        </w:rPr>
-        <w:t>Los puntos te suben por 5 Rangos Mentales: todos empiezan hoy en REACTIVO — donde manda el Saboteador — y el objetivo es llegar a INQUEBRANTABLE.</w:t>
+        <w:t>Apoyar a tu círculo paga. Invitar a alguien que entrena paga doble.</w:t>
       </w:r>
     </w:p>
     <w:p>
@@ -2545,49 +2054,31 @@
         <w:spacing w:before="60" w:after="80"/>
       </w:pPr>
       <w:r>
-        <w:t>&gt;</w:t>
+        <w:t>Los puntos te suben por 5 estados mentales: todos empiezan hoy en REACTIVO — donde manda el Saboteador — y el objetivo es llegar a INQUEBRANTABLE. Cada estado desbloquea material que no se consigue de otra forma.</w:t>
       </w:r>
     </w:p>
     <w:p>
       <w:pPr>
-        <w:spacing w:before="80" w:after="80"/>
-        <w:ind w:left="576"/>
+        <w:spacing w:before="60" w:after="80"/>
       </w:pPr>
       <w:r>
-        <w:rPr>
-          <w:i/>
-          <w:color w:val="334155"/>
-          <w:sz w:val="21"/>
-        </w:rPr>
-        <w:t>Y los premios: el número uno del leaderboard se lleva una beca COMPLETA del Método INGRESARIOS 3.0. Del dos al diez, licencias de los algoritmos Geny Trend y Reditum Sniper.”</w:t>
+        <w:t>Y ahora lo importante — los premios. El número uno del leaderboard se lleva una beca COMPLETA del Método INGRESARIOS 3.0. Completa.</w:t>
       </w:r>
     </w:p>
     <w:p>
       <w:pPr>
-        <w:spacing w:before="80" w:after="80"/>
-        <w:ind w:left="576"/>
+        <w:spacing w:before="60" w:after="80"/>
       </w:pPr>
       <w:r>
-        <w:rPr>
-          <w:i/>
-          <w:color w:val="334155"/>
-          <w:sz w:val="21"/>
-        </w:rPr>
-        <w:t>⚡ PREGUNTA RELÁMPAGO EN EL CHAT (MINUTO 36:00)</w:t>
+        <w:t>Del dos al diez, licencias de los algoritmos que van a conocer jueves y sábado. Y el mejor Círculo de Entrenamiento se sienta conmigo a analizar sus bitácoras en vivo.</w:t>
       </w:r>
     </w:p>
     <w:p>
       <w:pPr>
-        <w:spacing w:before="80" w:after="80"/>
-        <w:ind w:left="576"/>
+        <w:spacing w:before="60" w:after="80"/>
       </w:pPr>
       <w:r>
-        <w:rPr>
-          <w:i/>
-          <w:color w:val="334155"/>
-          <w:sz w:val="21"/>
-        </w:rPr>
-        <w:t>Juan Villegas: “Atención al chat: ¿Quién me dice primero cuál es el motivo científico por el cual nos cuesta cerrar en pérdida? ¿Perder duele el doble o lo mismo?”</w:t>
+        <w:t>Ah — y cuando lleguemos a 5,000 registrados, el pool de becas sube de una a tres. Así que invitar a tu amigo el que “ya casi le agarrá el truco”... es literalmente aumentar tus premios.</w:t>
       </w:r>
     </w:p>
     <w:p>
@@ -2595,21 +2086,23 @@
         <w:spacing w:before="60" w:after="80"/>
       </w:pPr>
       <w:r>
-        <w:t>&gt;</w:t>
+        <w:t>¿Listos para los primeros puntos grandes de la noche? Pregunta relámpago en el chat.</w:t>
       </w:r>
     </w:p>
     <w:p>
       <w:pPr>
-        <w:spacing w:before="80" w:after="80"/>
-        <w:ind w:left="576"/>
+        <w:spacing w:before="60" w:after="80"/>
       </w:pPr>
       <w:r>
-        <w:rPr>
-          <w:i/>
-          <w:color w:val="334155"/>
-          <w:sz w:val="21"/>
-        </w:rPr>
-        <w:t>*Juan lee al ganador en el chat:* “¡Carlos Mendoza respondió primero: 'EL DOBLE'! El CM anota a Carlos para sus +20 Puntos de Control.”</w:t>
+        <w:t>¿Quién me dice primero cuál es la causa científica por la que nos cuesta cerrar en pérdida? ¿Perder duele el doble o lo mismo?”</w:t>
+      </w:r>
+    </w:p>
+    <w:p>
+      <w:pPr>
+        <w:spacing w:before="60" w:after="80"/>
+      </w:pPr>
+      <w:r>
+        <w:t>Juan lee al primer ganador en el chat: “¡Carlos Mendoza respondió primero: 'EL DOBLE'! El CM anota a Carlos para sus +20 Puntos de Control.”</w:t>
       </w:r>
     </w:p>
     <w:p>
@@ -2622,7 +2115,20 @@
           <w:color w:val="2563EB"/>
           <w:sz w:val="26"/>
         </w:rPr>
-        <w:t>38:00 $\rightarrow$ 42:00 | B8 · DEMO DEL TEST EN PANTALLA — La GENOMA App</w:t>
+        <w:t>38:00 → 42:00</w:t>
+      </w:r>
+    </w:p>
+    <w:p>
+      <w:pPr>
+        <w:spacing w:before="240" w:after="80"/>
+      </w:pPr>
+      <w:r>
+        <w:rPr>
+          <w:b/>
+          <w:color w:val="2563EB"/>
+          <w:sz w:val="26"/>
+        </w:rPr>
+        <w:t>B8 · EL ENTRENAMIENTO — demo del Test del Saboteador en vivo</w:t>
       </w:r>
     </w:p>
     <w:p>
@@ -2637,53 +2143,23 @@
         <w:t>EN PANTALLA:</w:t>
       </w:r>
       <w:r>
-        <w:t xml:space="preserve"> Screen Share de Juan mostrando en vivo la web app (`taller.ingresarios.net/app`). Responde 2 preguntas de ejemplo y muestra cómo se genera la </w:t>
-      </w:r>
-      <w:r>
-        <w:rPr>
-          <w:b/>
-        </w:rPr>
-        <w:t>Card de Resultado de Arquetipo</w:t>
-      </w:r>
-      <w:r>
-        <w:t xml:space="preserve"> y cómo se enciende la </w:t>
-      </w:r>
-      <w:r>
-        <w:rPr>
-          <w:b/>
-        </w:rPr>
-        <w:t>Insignia 1: Domador Saboteador</w:t>
-      </w:r>
-      <w:r>
-        <w:t>.</w:t>
+        <w:t xml:space="preserve"> Demo en vivo: Juan abre el test en la GENOMA App en pantalla (Screen Share), responde 2 preguntas de ejemplo, muestra la card de resultado "MI SABOTEADOR ES EL VENGADOR" y cómo se activa la Insignia #1.</w:t>
       </w:r>
     </w:p>
     <w:p>
       <w:pPr>
-        <w:spacing w:before="80" w:after="80"/>
-        <w:ind w:left="576"/>
+        <w:spacing w:before="60" w:after="80"/>
       </w:pPr>
       <w:r>
-        <w:rPr>
-          <w:i/>
-          <w:color w:val="334155"/>
-          <w:sz w:val="21"/>
-        </w:rPr>
-        <w:t>Juan Villegas:</w:t>
+        <w:t>“Miren mi pantalla. Su primer entrenamiento oficial. El test que les prometí al inicio.</w:t>
       </w:r>
     </w:p>
     <w:p>
       <w:pPr>
-        <w:spacing w:before="80" w:after="80"/>
-        <w:ind w:left="576"/>
+        <w:spacing w:before="60" w:after="80"/>
       </w:pPr>
       <w:r>
-        <w:rPr>
-          <w:i/>
-          <w:color w:val="334155"/>
-          <w:sz w:val="21"/>
-        </w:rPr>
-        <w:t>“Miren mi pantalla. Este es el sistema de entrenamiento en la GENOMA App que van a usar al terminar la transmisión.</w:t>
+        <w:t>Ocho preguntas. Dos minutos. Sin respuestas buenas ni malas — el test no mide lo que sabes, mide cómo reaccionas. Al final te dice cuál de los cuatro está operando tu cuenta y te da su antídoto específico para esta semana.</w:t>
       </w:r>
     </w:p>
     <w:p>
@@ -2691,65 +2167,15 @@
         <w:spacing w:before="60" w:after="80"/>
       </w:pPr>
       <w:r>
-        <w:t>&gt;</w:t>
+        <w:t>Miren cómo se ve el mío... — sí, yo también tengo. El mío es el Vengador. Treinta años de mercados y todavía, cuando pierdo, algo adentro me susurra “recupéralo YA”. La diferencia es que ya no tiene el teclado.</w:t>
       </w:r>
     </w:p>
     <w:p>
       <w:pPr>
-        <w:spacing w:before="80" w:after="80"/>
-        <w:ind w:left="576"/>
+        <w:spacing w:before="60" w:after="80"/>
       </w:pPr>
       <w:r>
-        <w:rPr>
-          <w:i/>
-          <w:color w:val="334155"/>
-          <w:sz w:val="21"/>
-        </w:rPr>
-        <w:t>Es un test de 8 preguntas, les toma menos de 2 minutos. Sin respuestas buenas ni malas — mide cómo reaccionas bajo presión. Al terminar, la App les genera automáticamente su Card Oficial.</w:t>
-      </w:r>
-    </w:p>
-    <w:p>
-      <w:pPr>
-        <w:spacing w:before="60" w:after="80"/>
-      </w:pPr>
-      <w:r>
-        <w:t>&gt;</w:t>
-      </w:r>
-    </w:p>
-    <w:p>
-      <w:pPr>
-        <w:spacing w:before="80" w:after="80"/>
-        <w:ind w:left="576"/>
-      </w:pPr>
-      <w:r>
-        <w:rPr>
-          <w:i/>
-          <w:color w:val="334155"/>
-          <w:sz w:val="21"/>
-        </w:rPr>
-        <w:t>Miren la mía... sí, la mía dice EL VENGADOR. Treinta años en los mercados y todavía cuando pierdo algo adentro me susurra ‘recupéralo YA’. La diferencia es que hoy mi sistema le quitó el teclado.</w:t>
-      </w:r>
-    </w:p>
-    <w:p>
-      <w:pPr>
-        <w:spacing w:before="60" w:after="80"/>
-      </w:pPr>
-      <w:r>
-        <w:t>&gt;</w:t>
-      </w:r>
-    </w:p>
-    <w:p>
-      <w:pPr>
-        <w:spacing w:before="80" w:after="80"/>
-        <w:ind w:left="576"/>
-      </w:pPr>
-      <w:r>
-        <w:rPr>
-          <w:i/>
-          <w:color w:val="334155"/>
-          <w:sz w:val="21"/>
-        </w:rPr>
-        <w:t>Al completar este test en la App esta noche, desbloquean su Insignia #1: Domador Saboteador, ganan 30 Puntos de Control y quedan registrados en el Leaderboard oficial.”</w:t>
+        <w:t>Al terminar les genera esta card y les activa la Insignia #1: Domador Saboteador en la App. Publíquenla en la comunidad — son 30 Puntos de Control. Y si la comparten en sus stories con #JuegoMental y nos etiquetan, son 15 más. Mañana voy a leer al aire los resultados más comentados.”</w:t>
       </w:r>
     </w:p>
     <w:p>
@@ -2762,7 +2188,87 @@
           <w:color w:val="2563EB"/>
           <w:sz w:val="26"/>
         </w:rPr>
-        <w:t>42:00 $\rightarrow$ 45:00 | B9 · EL CLIFFHANGER &amp; TAREA NOCTURNA — Cierre en Alto</w:t>
+        <w:t>42:00 → 45:00</w:t>
+      </w:r>
+    </w:p>
+    <w:p>
+      <w:pPr>
+        <w:spacing w:before="240" w:after="80"/>
+      </w:pPr>
+      <w:r>
+        <w:rPr>
+          <w:b/>
+          <w:color w:val="2563EB"/>
+          <w:sz w:val="26"/>
+        </w:rPr>
+        <w:t>B9 · EL CLIFFHANGER &amp; TAREA NOCTURNA — la cuenta real y cierre</w:t>
+      </w:r>
+    </w:p>
+    <w:p>
+      <w:pPr>
+        <w:spacing w:before="60" w:after="80"/>
+      </w:pPr>
+      <w:r>
+        <w:t xml:space="preserve">⚡ </w:t>
+      </w:r>
+      <w:r>
+        <w:rPr>
+          <w:b/>
+        </w:rPr>
+        <w:t>ENCUESTA 3 (YOUTUBE LIVE — MINUTO 42:00)</w:t>
+      </w:r>
+      <w:r/>
+    </w:p>
+    <w:p>
+      <w:pPr>
+        <w:spacing w:before="60" w:after="80"/>
+      </w:pPr>
+      <w:r/>
+      <w:r>
+        <w:rPr>
+          <w:b/>
+        </w:rPr>
+        <w:t>“¿Cuándo vas a hacer el test en la App?”</w:t>
+      </w:r>
+      <w:r/>
+    </w:p>
+    <w:p>
+      <w:pPr>
+        <w:spacing w:before="60" w:after="80"/>
+      </w:pPr>
+      <w:r>
+        <w:t>A) ¡AHORA MISMO! al terminar el live</w:t>
+      </w:r>
+    </w:p>
+    <w:p>
+      <w:pPr>
+        <w:spacing w:before="60" w:after="80"/>
+      </w:pPr>
+      <w:r>
+        <w:t>B) Esta noche antes de dormir</w:t>
+      </w:r>
+    </w:p>
+    <w:p>
+      <w:pPr>
+        <w:spacing w:before="60" w:after="80"/>
+      </w:pPr>
+      <w:r>
+        <w:t>C) Mañana temprano</w:t>
+      </w:r>
+    </w:p>
+    <w:p>
+      <w:pPr>
+        <w:spacing w:before="60" w:after="80"/>
+      </w:pPr>
+      <w:r/>
+      <w:r>
+        <w:rPr>
+          <w:b/>
+        </w:rPr>
+        <w:t>Juan:</w:t>
+      </w:r>
+      <w:r>
+        <w:t xml:space="preserve"> “80% dijo AHORA MISMO. Quedó grabado, ¿eh? El leaderboard de mañana no miente.” (El compromiso público multiplica la ejecución — y la ejecución del día 1 predice la conversión del día 7.)</w:t>
       </w:r>
     </w:p>
     <w:p>
@@ -2777,119 +2283,71 @@
         <w:t>EN PANTALLA:</w:t>
       </w:r>
       <w:r>
-        <w:t xml:space="preserve"> Slide final: Captura borrosa de la plataforma de trading de Juan con el saldo pixelado + Texto: *"MAÑANA 7:00 P.M. • LA CUENTA ESPEJO"*.</w:t>
+        <w:t xml:space="preserve"> Slide final: captura BORROSA de una plataforma de trading — el saldo pixelado. Texto: *"MAÑANA 7:00 P.M. CO"*</w:t>
       </w:r>
     </w:p>
     <w:p>
       <w:pPr>
-        <w:spacing w:before="80" w:after="80"/>
-        <w:ind w:left="576"/>
+        <w:spacing w:before="60" w:after="80"/>
       </w:pPr>
       <w:r>
-        <w:rPr>
-          <w:i/>
-          <w:color w:val="334155"/>
-          <w:sz w:val="21"/>
-        </w:rPr>
-        <w:t>⚡ ENCUESTA 3 (YOUTUBE LIVE — MINUTO 42:00)</w:t>
+        <w:t>“Última cosa y los dejo ir — el loop del minuto 4 que les debo.</w:t>
       </w:r>
     </w:p>
     <w:p>
       <w:pPr>
-        <w:spacing w:before="80" w:after="80"/>
-        <w:ind w:left="576"/>
+        <w:spacing w:before="60" w:after="80"/>
       </w:pPr>
       <w:r>
-        <w:rPr>
-          <w:i/>
-          <w:color w:val="334155"/>
-          <w:sz w:val="21"/>
-        </w:rPr>
-        <w:t>“¿Cuándo vas a hacer tu Test en la App?”</w:t>
+        <w:t>Esto que ven borroso es mi cuenta. Real. La que opero.</w:t>
       </w:r>
     </w:p>
     <w:p>
       <w:pPr>
-        <w:spacing w:before="80" w:after="80"/>
-        <w:ind w:left="576"/>
+        <w:spacing w:before="60" w:after="80"/>
       </w:pPr>
       <w:r>
-        <w:rPr>
-          <w:i/>
-          <w:color w:val="334155"/>
-          <w:sz w:val="21"/>
-        </w:rPr>
-        <w:t>- A) ¡AHORA MISMO al terminar el live!</w:t>
+        <w:t>Mañana a las 7 en punto la van a ver SIN pixelar: el saldo exacto, la bitácora completa, y algo que me cuesta más mostrar que el saldo: los trades donde MI saboteador intentó firmar. Señalados uno a uno, con lo que hice para quitarle el teclado.</w:t>
       </w:r>
     </w:p>
     <w:p>
       <w:pPr>
-        <w:spacing w:before="80" w:after="80"/>
-        <w:ind w:left="576"/>
+        <w:spacing w:before="60" w:after="80"/>
       </w:pPr>
       <w:r>
-        <w:rPr>
-          <w:i/>
-          <w:color w:val="334155"/>
-          <w:sz w:val="21"/>
-        </w:rPr>
-        <w:t>- B) Esta noche antes de dormir</w:t>
+        <w:t>Ningún educador de este mercado en Latinoamérica hace eso.</w:t>
       </w:r>
     </w:p>
     <w:p>
       <w:pPr>
-        <w:spacing w:before="80" w:after="80"/>
-        <w:ind w:left="576"/>
+        <w:spacing w:before="60" w:after="80"/>
       </w:pPr>
       <w:r>
-        <w:rPr>
-          <w:i/>
-          <w:color w:val="334155"/>
-          <w:sz w:val="21"/>
-        </w:rPr>
-        <w:t>- C) Mañana temprano</w:t>
+        <w:t>Los que llegan en los primeros 5 minutos ven el saldo primero — la Primera Campana paga 10 puntos, ya saben.</w:t>
       </w:r>
     </w:p>
     <w:p>
       <w:pPr>
-        <w:spacing w:before="80" w:after="80"/>
-        <w:ind w:left="576"/>
+        <w:spacing w:before="60" w:after="80"/>
       </w:pPr>
       <w:r>
-        <w:rPr>
-          <w:i/>
-          <w:color w:val="334155"/>
-          <w:sz w:val="21"/>
-        </w:rPr>
-        <w:t>Juan Villegas:</w:t>
+        <w:t>Su tarea de esta noche: entren a `taller.ingresarios.net/app`, respondan su test, obtengan su card y su Insignia #1. 45 puntos posibles esta noche. El link está en el chat AHORA. Y les pido una cosa: háganlo hoy. No mañana. Su saboteador vota por mañana — esa es exactamente la primera batalla del juego.</w:t>
       </w:r>
     </w:p>
     <w:p>
       <w:pPr>
-        <w:spacing w:before="80" w:after="80"/>
-        <w:ind w:left="576"/>
+        <w:spacing w:before="60" w:after="80"/>
       </w:pPr>
       <w:r>
-        <w:rPr>
-          <w:i/>
-          <w:color w:val="334155"/>
-          <w:sz w:val="21"/>
-        </w:rPr>
-        <w:t>“Última cosa y los dejo ir — el loop que les debo del minuto 4.</w:t>
+        <w:t>Escriban NOS VEMOS en el chat si mañana están aquí a las 7.</w:t>
       </w:r>
     </w:p>
     <w:p>
       <w:pPr>
-        <w:spacing w:before="80" w:after="80"/>
-        <w:ind w:left="576"/>
+        <w:spacing w:before="60" w:after="80"/>
       </w:pPr>
       <w:r>
-        <w:rPr>
-          <w:i/>
-          <w:color w:val="334155"/>
-          <w:sz w:val="21"/>
-        </w:rPr>
-        <w:t>Esto que ven borroso en pantalla es mi cuenta real. La que opero todos los días.</w:t>
+        <w:t>...Miren ese chat. Esto va a estar bueno.</w:t>
       </w:r>
     </w:p>
     <w:p>
@@ -2897,128 +2355,23 @@
         <w:spacing w:before="60" w:after="80"/>
       </w:pPr>
       <w:r>
-        <w:t>&gt;</w:t>
+        <w:t xml:space="preserve">Soy </w:t>
+      </w:r>
+      <w:r>
+        <w:rPr>
+          <w:b/>
+        </w:rPr>
+        <w:t>Juan Villegas</w:t>
+      </w:r>
+      <w:r>
+        <w:t>. Esto es El Juego Mental del Dinero.</w:t>
       </w:r>
     </w:p>
     <w:p>
       <w:pPr>
-        <w:spacing w:before="80" w:after="80"/>
-        <w:ind w:left="576"/>
+        <w:spacing w:before="60" w:after="80"/>
       </w:pPr>
       <w:r>
-        <w:rPr>
-          <w:i/>
-          <w:color w:val="334155"/>
-          <w:sz w:val="21"/>
-        </w:rPr>
-        <w:t>Mañana a las 7:00 PM en punto la van a ver SIN pixelar: el saldo exacto, la bitácora completa, y algo que me cuesta más mostrar que el dinero: los trades donde MI saboteador intentó firmar y cómo el sistema lo contuvo.</w:t>
-      </w:r>
-    </w:p>
-    <w:p>
-      <w:pPr>
-        <w:spacing w:before="60" w:after="80"/>
-      </w:pPr>
-      <w:r>
-        <w:t>&gt;</w:t>
-      </w:r>
-    </w:p>
-    <w:p>
-      <w:pPr>
-        <w:spacing w:before="80" w:after="80"/>
-        <w:ind w:left="576"/>
-      </w:pPr>
-      <w:r>
-        <w:rPr>
-          <w:i/>
-          <w:color w:val="334155"/>
-          <w:sz w:val="21"/>
-        </w:rPr>
-        <w:t>Ningún educador en Latinoamérica hace eso en vivo.</w:t>
-      </w:r>
-    </w:p>
-    <w:p>
-      <w:pPr>
-        <w:spacing w:before="60" w:after="80"/>
-      </w:pPr>
-      <w:r>
-        <w:t>&gt;</w:t>
-      </w:r>
-    </w:p>
-    <w:p>
-      <w:pPr>
-        <w:spacing w:before="80" w:after="80"/>
-        <w:ind w:left="576"/>
-      </w:pPr>
-      <w:r>
-        <w:rPr>
-          <w:i/>
-          <w:color w:val="334155"/>
-          <w:sz w:val="21"/>
-        </w:rPr>
-        <w:t>SU ÚNICA TAREA DE ESTA NOCHE:</w:t>
-      </w:r>
-    </w:p>
-    <w:p>
-      <w:pPr>
-        <w:spacing w:before="80" w:after="80"/>
-        <w:ind w:left="576"/>
-      </w:pPr>
-      <w:r>
-        <w:rPr>
-          <w:i/>
-          <w:color w:val="334155"/>
-          <w:sz w:val="21"/>
-        </w:rPr>
-        <w:t>Entren ahora mismo a `taller.ingresarios.net/app`, hagan su Test del Saboteador, reclamen su Insignia 1: Domador Saboteador y sumen sus primeros 30 Puntos de Control. El link directo está fijado arriba en el chat de YouTube.</w:t>
-      </w:r>
-    </w:p>
-    <w:p>
-      <w:pPr>
-        <w:spacing w:before="60" w:after="80"/>
-      </w:pPr>
-      <w:r>
-        <w:t>&gt;</w:t>
-      </w:r>
-    </w:p>
-    <w:p>
-      <w:pPr>
-        <w:spacing w:before="80" w:after="80"/>
-        <w:ind w:left="576"/>
-      </w:pPr>
-      <w:r>
-        <w:rPr>
-          <w:i/>
-          <w:color w:val="334155"/>
-          <w:sz w:val="21"/>
-        </w:rPr>
-        <w:t>Escriban NOS VEMOS en el chat si mañana están aquí a las 7:00 PM.</w:t>
-      </w:r>
-    </w:p>
-    <w:p>
-      <w:pPr>
-        <w:spacing w:before="80" w:after="80"/>
-        <w:ind w:left="576"/>
-      </w:pPr>
-      <w:r>
-        <w:rPr>
-          <w:i/>
-          <w:color w:val="334155"/>
-          <w:sz w:val="21"/>
-        </w:rPr>
-        <w:t>Soy Juan Villegas. Esto es El Juego Mental del Dinero.</w:t>
-      </w:r>
-    </w:p>
-    <w:p>
-      <w:pPr>
-        <w:spacing w:before="80" w:after="80"/>
-        <w:ind w:left="576"/>
-      </w:pPr>
-      <w:r>
-        <w:rPr>
-          <w:i/>
-          <w:color w:val="334155"/>
-          <w:sz w:val="21"/>
-        </w:rPr>
         <w:t>Y desde hoy, tu saboteador sabe que lo estás mirando. Buenas noches.”</w:t>
       </w:r>
     </w:p>
@@ -3027,7 +2380,7 @@
         <w:spacing w:before="60" w:after="80"/>
       </w:pPr>
       <w:r>
-        <w:t>*(Corte a pantalla final: QR del test + link `taller.ingresarios.net/app` + hashtag #JuegoMental + "MAÑANA: LA CUENTA ESPEJO · 7:00 P.M. CO")*</w:t>
+        <w:t>*(Corte a pantalla final: QR del test + hashtag #JuegoMental + "MAÑANA: LA CUENTA ESPEJO · 7:00 P.M. CO")*</w:t>
       </w:r>
     </w:p>
     <w:p>
@@ -3040,7 +2393,7 @@
           <w:color w:val="0F172A"/>
           <w:sz w:val="30"/>
         </w:rPr>
-        <w:t>Apéndice de Producción Técnica (YouTube Studio + OBS / StreamYard)</w:t>
+        <w:t>Apéndice de producción</w:t>
       </w:r>
     </w:p>
     <w:p>
@@ -3053,87 +2406,55 @@
           <w:color w:val="2563EB"/>
           <w:sz w:val="26"/>
         </w:rPr>
-        <w:t>Checklist Técnico antes de salir en vivo:</w:t>
+        <w:t>Checklist técnico YouTube (antes del live)</w:t>
       </w:r>
     </w:p>
     <w:p>
       <w:pPr>
-        <w:pStyle w:val="ListNumber"/>
-        <w:spacing w:before="40" w:after="40"/>
-      </w:pPr>
-      <w:r/>
+        <w:spacing w:before="60" w:after="80"/>
+      </w:pPr>
       <w:r>
-        <w:rPr>
-          <w:b/>
-        </w:rPr>
-        <w:t>3 Encuestas precargadas o preparadas en borrador</w:t>
-      </w:r>
-      <w:r>
-        <w:t xml:space="preserve"> en YouTube Studio (Nombres: E1, E2, E3).</w:t>
+        <w:t>• Las 3 encuestas de YouTube precargadas/listas en borrador en YouTube Studio (nombradas E1, E2, E3).</w:t>
       </w:r>
     </w:p>
     <w:p>
       <w:pPr>
-        <w:pStyle w:val="ListNumber"/>
-        <w:spacing w:before="40" w:after="40"/>
-      </w:pPr>
-      <w:r/>
+        <w:spacing w:before="60" w:after="80"/>
+      </w:pPr>
       <w:r>
-        <w:rPr>
-          <w:b/>
-        </w:rPr>
-        <w:t>Moderador / CM #1 en Chat de YouTube</w:t>
-      </w:r>
-      <w:r>
-        <w:t>: Encargado de fijar enlaces, copiar mejores frases de saboteador y lanzar las encuestas.</w:t>
+        <w:t>• Co-host / CM #1 asignado para lanzar encuestas y fijar links (Juan NUNCA opera YouTube Studio mientras habla).</w:t>
       </w:r>
     </w:p>
     <w:p>
       <w:pPr>
-        <w:pStyle w:val="ListNumber"/>
-        <w:spacing w:before="40" w:after="40"/>
-      </w:pPr>
-      <w:r/>
+        <w:spacing w:before="60" w:after="80"/>
+      </w:pPr>
       <w:r>
-        <w:rPr>
-          <w:b/>
-        </w:rPr>
-        <w:t>Moderador / CM #2 en Chat de YouTube</w:t>
-      </w:r>
-      <w:r>
-        <w:t>: Encargado de anotar los nombres de ganadores de preguntas relámpago para sumar Puntos de Control en el panel `/admin`.</w:t>
+        <w:t>• CM #1 = chat (pregunta activa, sembrado, guardar frases de saboteador). CM #2 = leaderboard y registro de ganadores de preguntas relámpago.</w:t>
       </w:r>
     </w:p>
     <w:p>
       <w:pPr>
-        <w:pStyle w:val="ListNumber"/>
-        <w:spacing w:before="40" w:after="40"/>
-      </w:pPr>
-      <w:r/>
+        <w:spacing w:before="60" w:after="80"/>
+      </w:pPr>
       <w:r>
-        <w:rPr>
-          <w:b/>
-        </w:rPr>
-        <w:t>Escena de OBS / StreamYard lista para B8</w:t>
-      </w:r>
-      <w:r>
-        <w:t>: Captura de pantalla lista en la pestaña de `taller.ingresarios.net/app` mostrando el perfil de Juan.</w:t>
+        <w:t>• Escena de OBS/StreamYard con las 4 cards de arquetipos + captura borrosa de la cuenta lista para B9 + Screen Share de la App para B8.</w:t>
       </w:r>
     </w:p>
     <w:p>
       <w:pPr>
-        <w:pStyle w:val="ListNumber"/>
-        <w:spacing w:before="40" w:after="40"/>
-      </w:pPr>
-      <w:r/>
+        <w:spacing w:before="60" w:after="80"/>
+      </w:pPr>
       <w:r>
-        <w:rPr>
-          <w:b/>
-        </w:rPr>
-        <w:t>Slide final de B9 lista</w:t>
+        <w:t>• Grabación en nube activada — el replay solo vive 24 horas.</w:t>
       </w:r>
+    </w:p>
+    <w:p>
+      <w:pPr>
+        <w:spacing w:before="60" w:after="80"/>
+      </w:pPr>
       <w:r>
-        <w:t>: Captura borrosa del saldo con el texto *"MAÑANA 7:00 PM CO"*.</w:t>
+        <w:t>• Plan B: si las encuestas de YouTube fallan, todas las votaciones migran al chat con letra (A/B/C/D) — el CM cuenta a mano las primeras 50.</w:t>
       </w:r>
     </w:p>
     <w:p>
@@ -3146,7 +2467,7 @@
           <w:color w:val="2563EB"/>
           <w:sz w:val="26"/>
         </w:rPr>
-        <w:t>Resumen de los 12 Momentos de Interacción en YouTube Live:</w:t>
+        <w:t>Los 12 momentos de interacción (resumen para el co-host)</w:t>
       </w:r>
     </w:p>
     <w:tbl>
@@ -3184,7 +2505,7 @@
                 <w:color w:val="FFFFFF"/>
                 <w:sz w:val="19"/>
               </w:rPr>
-              <w:t>Minuto</w:t>
+              <w:t>Min</w:t>
             </w:r>
           </w:p>
         </w:tc>
@@ -3203,7 +2524,7 @@
                 <w:color w:val="FFFFFF"/>
                 <w:sz w:val="19"/>
               </w:rPr>
-              <w:t>Tipo de Interacción</w:t>
+              <w:t>Tipo</w:t>
             </w:r>
           </w:p>
         </w:tc>
@@ -3222,7 +2543,7 @@
                 <w:color w:val="FFFFFF"/>
                 <w:sz w:val="19"/>
               </w:rPr>
-              <w:t>Acción en Vivo</w:t>
+              <w:t>Acción</w:t>
             </w:r>
           </w:p>
         </w:tc>
@@ -3266,7 +2587,7 @@
               <w:rPr>
                 <w:sz w:val="19"/>
               </w:rPr>
-              <w:t>¿Cuánto llevas intentando ganarle al mercado? (A/B/C/D)</w:t>
+              <w:t>¿Cuánto llevas operando? (queda abierta)</w:t>
             </w:r>
           </w:p>
         </w:tc>
@@ -3340,7 +2661,7 @@
               <w:rPr>
                 <w:sz w:val="19"/>
               </w:rPr>
-              <w:t>Chat Storm #1</w:t>
+              <w:t>Chat storm #1</w:t>
             </w:r>
           </w:p>
         </w:tc>
@@ -3354,7 +2675,7 @@
               <w:rPr>
                 <w:sz w:val="19"/>
               </w:rPr>
-              <w:t>"PRESENTE + Ciudad" — Juan lee 5 ciudades en voz alta</w:t>
+              <w:t>"PRESENTE + ciudad" — Juan lee 4–5 nombres</w:t>
             </w:r>
           </w:p>
         </w:tc>
@@ -3398,7 +2719,7 @@
               <w:rPr>
                 <w:sz w:val="19"/>
               </w:rPr>
-              <w:t>Juan analiza el resultado de la Encuesta #1</w:t>
+              <w:t>Juan analiza resultado Encuesta 1</w:t>
             </w:r>
           </w:p>
         </w:tc>
@@ -3428,7 +2749,7 @@
               <w:rPr>
                 <w:sz w:val="19"/>
               </w:rPr>
-              <w:t>Chat Storm #2</w:t>
+              <w:t>Chat storm #2</w:t>
             </w:r>
           </w:p>
         </w:tc>
@@ -3442,7 +2763,7 @@
               <w:rPr>
                 <w:sz w:val="19"/>
               </w:rPr>
-              <w:t>"¿CARLOS o ANDRÉS?" — Juan lee nombres en voz alta</w:t>
+              <w:t>"¿CARLOS o ANDRÉS?" — Juan lee por nombre</w:t>
             </w:r>
           </w:p>
         </w:tc>
@@ -3486,7 +2807,7 @@
               <w:rPr>
                 <w:sz w:val="19"/>
               </w:rPr>
-              <w:t>¿Cuál Saboteador operó tu cuenta? (Vengador/Eufórico/Impaciente/Paralizado)</w:t>
+              <w:t>Encuesta 2: ¿cuál saboteador te operó? — revela apuesta</w:t>
             </w:r>
           </w:p>
         </w:tc>
@@ -3516,7 +2837,7 @@
               <w:rPr>
                 <w:sz w:val="19"/>
               </w:rPr>
-              <w:t>Chat Storm #3</w:t>
+              <w:t>Chat storm #3</w:t>
             </w:r>
           </w:p>
         </w:tc>
@@ -3530,7 +2851,7 @@
               <w:rPr>
                 <w:sz w:val="19"/>
               </w:rPr>
-              <w:t>Frase exacta de tu saboteador (Mina de copy para ads)</w:t>
+              <w:t>La frase exacta de tu saboteador (mina de copy)</w:t>
             </w:r>
           </w:p>
         </w:tc>
@@ -3560,7 +2881,7 @@
               <w:rPr>
                 <w:sz w:val="19"/>
               </w:rPr>
-              <w:t>Chat Storm</w:t>
+              <w:t>Chat storm</w:t>
             </w:r>
           </w:p>
         </w:tc>
@@ -3574,7 +2895,7 @@
               <w:rPr>
                 <w:sz w:val="19"/>
               </w:rPr>
-              <w:t>"SISTEMA" si entendieron la tesis central</w:t>
+              <w:t>"SISTEMA" si entendiste la tesis</w:t>
             </w:r>
           </w:p>
         </w:tc>
@@ -3706,7 +3027,7 @@
               <w:rPr>
                 <w:sz w:val="19"/>
               </w:rPr>
-              <w:t>¿Cuándo haces el test? (A: ¡AHORA MISMO! / B / C)</w:t>
+              <w:t>¿Cuándo haces el test? (compromiso público)</w:t>
             </w:r>
           </w:p>
         </w:tc>
@@ -3736,7 +3057,7 @@
               <w:rPr>
                 <w:sz w:val="19"/>
               </w:rPr>
-              <w:t>Chat Storm #4</w:t>
+              <w:t>Chat storm #4</w:t>
             </w:r>
           </w:p>
         </w:tc>
@@ -3750,7 +3071,7 @@
               <w:rPr>
                 <w:sz w:val="19"/>
               </w:rPr>
-              <w:t>"NOS VEMOS" — Cierre en alto y redirección a la App</w:t>
+              <w:t>"NOS VEMOS" — cierre en alto</w:t>
             </w:r>
           </w:p>
         </w:tc>
@@ -3767,31 +3088,33 @@
           <w:color w:val="2563EB"/>
           <w:sz w:val="26"/>
         </w:rPr>
-        <w:t>Notas de Tono para Juan Villegas:</w:t>
+        <w:t>Notas de tono para Juan Villegas</w:t>
       </w:r>
     </w:p>
     <w:p>
       <w:pPr>
-        <w:pStyle w:val="ListBullet"/>
-        <w:spacing w:before="40" w:after="40"/>
-      </w:pPr>
-      <w:r/>
+        <w:spacing w:before="60" w:after="80"/>
+      </w:pPr>
+      <w:r>
+        <w:t xml:space="preserve">• </w:t>
+      </w:r>
       <w:r>
         <w:rPr>
           <w:b/>
         </w:rPr>
-        <w:t>El Saboteador SIEMPRE se nombra con respeto y empatía</w:t>
+        <w:t>El Saboteador SIEMPRE se nombra con respeto, casi con cariño</w:t>
       </w:r>
       <w:r>
-        <w:t>, casi con cariño — nunca con burla. El público se está reconociendo; si te burlas del arquetipo, te burlas de ellos.</w:t>
+        <w:t xml:space="preserve"> — nunca con burla. El público se está reconociendo; si te burlas del arquetipo, te burlas de ellos.</w:t>
       </w:r>
     </w:p>
     <w:p>
       <w:pPr>
-        <w:pStyle w:val="ListBullet"/>
-        <w:spacing w:before="40" w:after="40"/>
-      </w:pPr>
-      <w:r/>
+        <w:spacing w:before="60" w:after="80"/>
+      </w:pPr>
+      <w:r>
+        <w:t xml:space="preserve">• </w:t>
+      </w:r>
       <w:r>
         <w:rPr>
           <w:b/>
@@ -3799,31 +3122,33 @@
         <w:t>Confesión propia obligatoria</w:t>
       </w:r>
       <w:r>
-        <w:t>: Juan admite abiertamente que su arquetipo dominante es *El Vengador* en B8. La autoridad se construye con vulnerabilidad y evidencia, no con perfección.</w:t>
+        <w:t>: Juan admite su Vengador en B8. La autoridad aquí se construye con vulnerabilidad + evidencia, no con perfección.</w:t>
       </w:r>
     </w:p>
     <w:p>
       <w:pPr>
-        <w:pStyle w:val="ListBullet"/>
-        <w:spacing w:before="40" w:after="40"/>
-      </w:pPr>
-      <w:r/>
+        <w:spacing w:before="60" w:after="80"/>
+      </w:pPr>
+      <w:r>
+        <w:t xml:space="preserve">• </w:t>
+      </w:r>
       <w:r>
         <w:rPr>
           <w:b/>
         </w:rPr>
-        <w:t>La ciencia se cuenta como historia, no como cátedra universitaria</w:t>
+        <w:t>La ciencia se cuenta como historia, no como cátedra</w:t>
       </w:r>
       <w:r>
-        <w:t>: *"Le dieron un Nobel a Kahneman por demostrar esto"* funciona 10 veces mejor que teorizar sobre psicología del comportamiento.</w:t>
+        <w:t>: "le dieron un Nobel por demostrar esto" &gt; "según Kahneman y Tversky (1979)".</w:t>
       </w:r>
     </w:p>
     <w:p>
       <w:pPr>
-        <w:pStyle w:val="ListBullet"/>
-        <w:spacing w:before="40" w:after="40"/>
-      </w:pPr>
-      <w:r/>
+        <w:spacing w:before="60" w:after="80"/>
+      </w:pPr>
+      <w:r>
+        <w:t xml:space="preserve">• </w:t>
+      </w:r>
       <w:r>
         <w:rPr>
           <w:b/>
@@ -3831,7 +3156,7 @@
         <w:t>Cero venta directa en el Día 1</w:t>
       </w:r>
       <w:r>
-        <w:t>: No se menciona ningún precio ni producto comercial — solo la beca y los algoritmos como premios. La primera mención comercial del Método 3.0 es en el Día 6 (seeding) y la oferta completa en la Masterclass del Día 7.</w:t>
+        <w:t>. El producto no se menciona — solo la beca como premio. La primera mención comercial del Método 3.0 es el día 6 (seeding) y la oferta completa el día 7.</w:t>
       </w:r>
     </w:p>
     <w:sectPr>

</xml_diff>